<commit_message>
feat: adicionando criptografia de arquivos e descrição dos botões
</commit_message>
<xml_diff>
--- a/Documentacao_HubNITTRANS.docx
+++ b/Documentacao_HubNITTRANS.docx
@@ -88,7 +88,7 @@
           <w:rFonts w:ascii="Calibri" w:hAnsi="Calibri"/>
           <w:sz w:val="22"/>
         </w:rPr>
-        <w:t>1.0</w:t>
+        <w:t>2.0</w:t>
       </w:r>
     </w:p>
     <w:p>
@@ -199,7 +199,7 @@
           <w:rFonts w:ascii="Calibri" w:hAnsi="Calibri"/>
           <w:sz w:val="22"/>
         </w:rPr>
-        <w:t>O Hub de Ferramentas NITTRANS e uma aplicacao desktop Windows com interface grafica (modo escuro) que centraliza cinco automacoes de dados utilizadas internamente pela equipe tecnica. Cada ferramenta opera de forma independente: o usuario seleciona o arquivo de entrada, a ferramenta processa e gera o resultado, que pode ser exportado para qualquer destino.</w:t>
+        <w:t>O Hub de Ferramentas NITTRANS e uma aplicacao desktop Windows com interface grafica (modo escuro) que centraliza sete automacoes de dados utilizadas internamente pela equipe tecnica. Cada ferramenta opera de forma independente: o usuario seleciona o arquivo de entrada, a ferramenta processa e gera o resultado, que pode ser exportado para qualquer destino.</w:t>
       </w:r>
     </w:p>
     <w:p>
@@ -211,8 +211,422 @@
           <w:rFonts w:ascii="Calibri" w:hAnsi="Calibri"/>
           <w:sz w:val="22"/>
         </w:rPr>
-        <w:t>A aplicacao nao exige instalacao de Python nem de nenhuma dependencia: tudo esta empacotado no instalador .exe, que instala sem necessidade de privilegios de administrador.</w:t>
+        <w:t>A aplicacao nao exige instalacao de Python nem de nenhuma dependencia: tudo esta empacotado no instalador .exe, que instala sem necessidade de privilegios de administrador. Ao passar o mouse sobre qualquer botao, uma dica resumida descreve o que aquela ferramenta faz.</w:t>
       </w:r>
+    </w:p>
+    <w:p>
+      <w:pPr>
+        <w:spacing w:before="240" w:after="120"/>
+      </w:pPr>
+      <w:r>
+        <w:rPr>
+          <w:rFonts w:ascii="Calibri" w:hAnsi="Calibri"/>
+          <w:b/>
+          <w:color w:val="1F3564"/>
+          <w:sz w:val="26"/>
+        </w:rPr>
+        <w:t>Ferramentas disponíveis</w:t>
+      </w:r>
+    </w:p>
+    <w:tbl>
+      <w:tblPr>
+        <w:tblStyle w:val="TableGrid"/>
+        <w:tblW w:type="auto" w:w="0"/>
+        <w:jc w:val="left"/>
+        <w:tblLook w:firstColumn="1" w:firstRow="1" w:lastColumn="0" w:lastRow="0" w:noHBand="0" w:noVBand="1" w:val="04A0"/>
+      </w:tblPr>
+      <w:tblGrid>
+        <w:gridCol w:w="3041"/>
+        <w:gridCol w:w="3041"/>
+        <w:gridCol w:w="3041"/>
+      </w:tblGrid>
+      <w:tr>
+        <w:tc>
+          <w:tcPr>
+            <w:tcW w:type="dxa" w:w="567"/>
+            <w:shd w:val="clear" w:color="auto" w:fill="FF8C00"/>
+          </w:tcPr>
+          <w:p>
+            <w:r>
+              <w:rPr>
+                <w:rFonts w:ascii="Calibri" w:hAnsi="Calibri"/>
+                <w:b/>
+                <w:color w:val="FFFFFF"/>
+                <w:sz w:val="20"/>
+              </w:rPr>
+              <w:t>N.</w:t>
+            </w:r>
+          </w:p>
+        </w:tc>
+        <w:tc>
+          <w:tcPr>
+            <w:tcW w:type="dxa" w:w="2835"/>
+            <w:shd w:val="clear" w:color="auto" w:fill="FF8C00"/>
+          </w:tcPr>
+          <w:p>
+            <w:r>
+              <w:rPr>
+                <w:rFonts w:ascii="Calibri" w:hAnsi="Calibri"/>
+                <w:b/>
+                <w:color w:val="FFFFFF"/>
+                <w:sz w:val="20"/>
+              </w:rPr>
+              <w:t>Nome</w:t>
+            </w:r>
+          </w:p>
+        </w:tc>
+        <w:tc>
+          <w:tcPr>
+            <w:tcW w:type="dxa" w:w="5102"/>
+            <w:shd w:val="clear" w:color="auto" w:fill="FF8C00"/>
+          </w:tcPr>
+          <w:p>
+            <w:r>
+              <w:rPr>
+                <w:rFonts w:ascii="Calibri" w:hAnsi="Calibri"/>
+                <w:b/>
+                <w:color w:val="FFFFFF"/>
+                <w:sz w:val="20"/>
+              </w:rPr>
+              <w:t>Funcao resumida</w:t>
+            </w:r>
+          </w:p>
+        </w:tc>
+      </w:tr>
+      <w:tr>
+        <w:tc>
+          <w:tcPr>
+            <w:tcW w:type="dxa" w:w="567"/>
+            <w:shd w:val="clear" w:color="auto" w:fill="F5F5F5"/>
+          </w:tcPr>
+          <w:p>
+            <w:r>
+              <w:rPr>
+                <w:rFonts w:ascii="Calibri" w:hAnsi="Calibri"/>
+                <w:sz w:val="20"/>
+              </w:rPr>
+              <w:t>1</w:t>
+            </w:r>
+          </w:p>
+        </w:tc>
+        <w:tc>
+          <w:tcPr>
+            <w:tcW w:type="dxa" w:w="2835"/>
+            <w:shd w:val="clear" w:color="auto" w:fill="F5F5F5"/>
+          </w:tcPr>
+          <w:p>
+            <w:r>
+              <w:rPr>
+                <w:rFonts w:ascii="Calibri" w:hAnsi="Calibri"/>
+                <w:sz w:val="20"/>
+              </w:rPr>
+              <w:t>Latitude e Longitude</w:t>
+            </w:r>
+          </w:p>
+        </w:tc>
+        <w:tc>
+          <w:tcPr>
+            <w:tcW w:type="dxa" w:w="5102"/>
+            <w:shd w:val="clear" w:color="auto" w:fill="F5F5F5"/>
+          </w:tcPr>
+          <w:p>
+            <w:r>
+              <w:rPr>
+                <w:rFonts w:ascii="Calibri" w:hAnsi="Calibri"/>
+                <w:sz w:val="20"/>
+              </w:rPr>
+              <w:t>Converte coordenadas em enderecos via OpenStreetMap</w:t>
+            </w:r>
+          </w:p>
+        </w:tc>
+      </w:tr>
+      <w:tr>
+        <w:tc>
+          <w:tcPr>
+            <w:tcW w:type="dxa" w:w="567"/>
+            <w:shd w:val="clear" w:color="auto" w:fill="FFFFFF"/>
+          </w:tcPr>
+          <w:p>
+            <w:r>
+              <w:rPr>
+                <w:rFonts w:ascii="Calibri" w:hAnsi="Calibri"/>
+                <w:sz w:val="20"/>
+              </w:rPr>
+              <w:t>2</w:t>
+            </w:r>
+          </w:p>
+        </w:tc>
+        <w:tc>
+          <w:tcPr>
+            <w:tcW w:type="dxa" w:w="2835"/>
+            <w:shd w:val="clear" w:color="auto" w:fill="FFFFFF"/>
+          </w:tcPr>
+          <w:p>
+            <w:r>
+              <w:rPr>
+                <w:rFonts w:ascii="Calibri" w:hAnsi="Calibri"/>
+                <w:sz w:val="20"/>
+              </w:rPr>
+              <w:t>Limpeza de Arquivos</w:t>
+            </w:r>
+          </w:p>
+        </w:tc>
+        <w:tc>
+          <w:tcPr>
+            <w:tcW w:type="dxa" w:w="5102"/>
+            <w:shd w:val="clear" w:color="auto" w:fill="FFFFFF"/>
+          </w:tcPr>
+          <w:p>
+            <w:r>
+              <w:rPr>
+                <w:rFonts w:ascii="Calibri" w:hAnsi="Calibri"/>
+                <w:sz w:val="20"/>
+              </w:rPr>
+              <w:t>Corrige encoding e padroniza logradouros em planilhas</w:t>
+            </w:r>
+          </w:p>
+        </w:tc>
+      </w:tr>
+      <w:tr>
+        <w:tc>
+          <w:tcPr>
+            <w:tcW w:type="dxa" w:w="567"/>
+            <w:shd w:val="clear" w:color="auto" w:fill="F5F5F5"/>
+          </w:tcPr>
+          <w:p>
+            <w:r>
+              <w:rPr>
+                <w:rFonts w:ascii="Calibri" w:hAnsi="Calibri"/>
+                <w:sz w:val="20"/>
+              </w:rPr>
+              <w:t>3</w:t>
+            </w:r>
+          </w:p>
+        </w:tc>
+        <w:tc>
+          <w:tcPr>
+            <w:tcW w:type="dxa" w:w="2835"/>
+            <w:shd w:val="clear" w:color="auto" w:fill="F5F5F5"/>
+          </w:tcPr>
+          <w:p>
+            <w:r>
+              <w:rPr>
+                <w:rFonts w:ascii="Calibri" w:hAnsi="Calibri"/>
+                <w:sz w:val="20"/>
+              </w:rPr>
+              <w:t>Organizador TXT Detran</w:t>
+            </w:r>
+          </w:p>
+        </w:tc>
+        <w:tc>
+          <w:tcPr>
+            <w:tcW w:type="dxa" w:w="5102"/>
+            <w:shd w:val="clear" w:color="auto" w:fill="F5F5F5"/>
+          </w:tcPr>
+          <w:p>
+            <w:r>
+              <w:rPr>
+                <w:rFonts w:ascii="Calibri" w:hAnsi="Calibri"/>
+                <w:sz w:val="20"/>
+              </w:rPr>
+              <w:t>Converte .txt posicional do DETRAN em Excel estruturado</w:t>
+            </w:r>
+          </w:p>
+        </w:tc>
+      </w:tr>
+      <w:tr>
+        <w:tc>
+          <w:tcPr>
+            <w:tcW w:type="dxa" w:w="567"/>
+            <w:shd w:val="clear" w:color="auto" w:fill="FFFFFF"/>
+          </w:tcPr>
+          <w:p>
+            <w:r>
+              <w:rPr>
+                <w:rFonts w:ascii="Calibri" w:hAnsi="Calibri"/>
+                <w:sz w:val="20"/>
+              </w:rPr>
+              <w:t>4</w:t>
+            </w:r>
+          </w:p>
+        </w:tc>
+        <w:tc>
+          <w:tcPr>
+            <w:tcW w:type="dxa" w:w="2835"/>
+            <w:shd w:val="clear" w:color="auto" w:fill="FFFFFF"/>
+          </w:tcPr>
+          <w:p>
+            <w:r>
+              <w:rPr>
+                <w:rFonts w:ascii="Calibri" w:hAnsi="Calibri"/>
+                <w:sz w:val="20"/>
+              </w:rPr>
+              <w:t>Organizador Detran Limpo</w:t>
+            </w:r>
+          </w:p>
+        </w:tc>
+        <w:tc>
+          <w:tcPr>
+            <w:tcW w:type="dxa" w:w="5102"/>
+            <w:shd w:val="clear" w:color="auto" w:fill="FFFFFF"/>
+          </w:tcPr>
+          <w:p>
+            <w:r>
+              <w:rPr>
+                <w:rFonts w:ascii="Calibri" w:hAnsi="Calibri"/>
+                <w:sz w:val="20"/>
+              </w:rPr>
+              <w:t>Limpa coluna de endereco removendo numeros e sufixos</w:t>
+            </w:r>
+          </w:p>
+        </w:tc>
+      </w:tr>
+      <w:tr>
+        <w:tc>
+          <w:tcPr>
+            <w:tcW w:type="dxa" w:w="567"/>
+            <w:shd w:val="clear" w:color="auto" w:fill="F5F5F5"/>
+          </w:tcPr>
+          <w:p>
+            <w:r>
+              <w:rPr>
+                <w:rFonts w:ascii="Calibri" w:hAnsi="Calibri"/>
+                <w:sz w:val="20"/>
+              </w:rPr>
+              <w:t>5</w:t>
+            </w:r>
+          </w:p>
+        </w:tc>
+        <w:tc>
+          <w:tcPr>
+            <w:tcW w:type="dxa" w:w="2835"/>
+            <w:shd w:val="clear" w:color="auto" w:fill="F5F5F5"/>
+          </w:tcPr>
+          <w:p>
+            <w:r>
+              <w:rPr>
+                <w:rFonts w:ascii="Calibri" w:hAnsi="Calibri"/>
+                <w:sz w:val="20"/>
+              </w:rPr>
+              <w:t>PDF e Excel Multas</w:t>
+            </w:r>
+          </w:p>
+        </w:tc>
+        <w:tc>
+          <w:tcPr>
+            <w:tcW w:type="dxa" w:w="5102"/>
+            <w:shd w:val="clear" w:color="auto" w:fill="F5F5F5"/>
+          </w:tcPr>
+          <w:p>
+            <w:r>
+              <w:rPr>
+                <w:rFonts w:ascii="Calibri" w:hAnsi="Calibri"/>
+                <w:sz w:val="20"/>
+              </w:rPr>
+              <w:t>Extrai processos deferidos/indeferidos de PDFs GAIDE</w:t>
+            </w:r>
+          </w:p>
+        </w:tc>
+      </w:tr>
+      <w:tr>
+        <w:tc>
+          <w:tcPr>
+            <w:tcW w:type="dxa" w:w="567"/>
+            <w:shd w:val="clear" w:color="auto" w:fill="FFFFFF"/>
+          </w:tcPr>
+          <w:p>
+            <w:r>
+              <w:rPr>
+                <w:rFonts w:ascii="Calibri" w:hAnsi="Calibri"/>
+                <w:sz w:val="20"/>
+              </w:rPr>
+              <w:t>6</w:t>
+            </w:r>
+          </w:p>
+        </w:tc>
+        <w:tc>
+          <w:tcPr>
+            <w:tcW w:type="dxa" w:w="2835"/>
+            <w:shd w:val="clear" w:color="auto" w:fill="FFFFFF"/>
+          </w:tcPr>
+          <w:p>
+            <w:r>
+              <w:rPr>
+                <w:rFonts w:ascii="Calibri" w:hAnsi="Calibri"/>
+                <w:sz w:val="20"/>
+              </w:rPr>
+              <w:t>Processos Abertos</w:t>
+            </w:r>
+          </w:p>
+        </w:tc>
+        <w:tc>
+          <w:tcPr>
+            <w:tcW w:type="dxa" w:w="5102"/>
+            <w:shd w:val="clear" w:color="auto" w:fill="FFFFFF"/>
+          </w:tcPr>
+          <w:p>
+            <w:r>
+              <w:rPr>
+                <w:rFonts w:ascii="Calibri" w:hAnsi="Calibri"/>
+                <w:sz w:val="20"/>
+              </w:rPr>
+              <w:t>Le relatorios PDF de Processos Abertos e exporta para Excel</w:t>
+            </w:r>
+          </w:p>
+        </w:tc>
+      </w:tr>
+      <w:tr>
+        <w:tc>
+          <w:tcPr>
+            <w:tcW w:type="dxa" w:w="567"/>
+            <w:shd w:val="clear" w:color="auto" w:fill="F5F5F5"/>
+          </w:tcPr>
+          <w:p>
+            <w:r>
+              <w:rPr>
+                <w:rFonts w:ascii="Calibri" w:hAnsi="Calibri"/>
+                <w:sz w:val="20"/>
+              </w:rPr>
+              <w:t>7</w:t>
+            </w:r>
+          </w:p>
+        </w:tc>
+        <w:tc>
+          <w:tcPr>
+            <w:tcW w:type="dxa" w:w="2835"/>
+            <w:shd w:val="clear" w:color="auto" w:fill="F5F5F5"/>
+          </w:tcPr>
+          <w:p>
+            <w:r>
+              <w:rPr>
+                <w:rFonts w:ascii="Calibri" w:hAnsi="Calibri"/>
+                <w:sz w:val="20"/>
+              </w:rPr>
+              <w:t>Criptografar Arquivos</w:t>
+            </w:r>
+          </w:p>
+        </w:tc>
+        <w:tc>
+          <w:tcPr>
+            <w:tcW w:type="dxa" w:w="5102"/>
+            <w:shd w:val="clear" w:color="auto" w:fill="F5F5F5"/>
+          </w:tcPr>
+          <w:p>
+            <w:r>
+              <w:rPr>
+                <w:rFonts w:ascii="Calibri" w:hAnsi="Calibri"/>
+                <w:sz w:val="20"/>
+              </w:rPr>
+              <w:t>Criptografa arquivos com AES-256 e gera HTML autocontido</w:t>
+            </w:r>
+          </w:p>
+        </w:tc>
+      </w:tr>
+    </w:tbl>
+    <w:p>
+      <w:pPr>
+        <w:spacing w:after="80"/>
+      </w:pPr>
     </w:p>
     <w:p>
       <w:pPr>
@@ -309,7 +723,7 @@
           <w:color w:val="202020"/>
           <w:sz w:val="18"/>
         </w:rPr>
-        <w:t>|-- version_info.txt              &lt;- Metadados de autoria do .exe</w:t>
+        <w:t>|-- version_info.txt              &lt;- Metadados de autoria do .exe (v2.0)</w:t>
       </w:r>
     </w:p>
     <w:p>
@@ -463,7 +877,7 @@
           <w:color w:val="202020"/>
           <w:sz w:val="18"/>
         </w:rPr>
-        <w:t>|-- PdfExcelMultas/</w:t>
+        <w:t>|-- DetranLimpo/</w:t>
       </w:r>
     </w:p>
     <w:p>
@@ -477,7 +891,35 @@
           <w:color w:val="202020"/>
           <w:sz w:val="18"/>
         </w:rPr>
-        <w:t>|   |-- pdfDeferidoIndeferido.py &lt;- Ferramenta 4</w:t>
+        <w:t>|   |-- detranLimpo.py           &lt;- Ferramenta 4</w:t>
+      </w:r>
+    </w:p>
+    <w:p>
+      <w:pPr>
+        <w:spacing w:after="20" w:before="20"/>
+        <w:ind w:left="567"/>
+      </w:pPr>
+      <w:r>
+        <w:rPr>
+          <w:rFonts w:ascii="Courier New" w:hAnsi="Courier New"/>
+          <w:color w:val="202020"/>
+          <w:sz w:val="18"/>
+        </w:rPr>
+        <w:t>|-- PdfExcelMultas/</w:t>
+      </w:r>
+    </w:p>
+    <w:p>
+      <w:pPr>
+        <w:spacing w:after="20" w:before="20"/>
+        <w:ind w:left="567"/>
+      </w:pPr>
+      <w:r>
+        <w:rPr>
+          <w:rFonts w:ascii="Courier New" w:hAnsi="Courier New"/>
+          <w:color w:val="202020"/>
+          <w:sz w:val="18"/>
+        </w:rPr>
+        <w:t>|   |-- pdfDeferidoIndeferido.py &lt;- Ferramenta 5</w:t>
       </w:r>
     </w:p>
     <w:p>
@@ -505,7 +947,77 @@
           <w:color w:val="202020"/>
           <w:sz w:val="18"/>
         </w:rPr>
-        <w:t xml:space="preserve">    |-- processosAbertos.py      &lt;- Ferramenta 5</w:t>
+        <w:t>|   |-- processosAbertos.py      &lt;- Ferramenta 6</w:t>
+      </w:r>
+    </w:p>
+    <w:p>
+      <w:pPr>
+        <w:spacing w:after="20" w:before="20"/>
+        <w:ind w:left="567"/>
+      </w:pPr>
+      <w:r>
+        <w:rPr>
+          <w:rFonts w:ascii="Courier New" w:hAnsi="Courier New"/>
+          <w:color w:val="202020"/>
+          <w:sz w:val="18"/>
+        </w:rPr>
+        <w:t>|-- Criptografia/</w:t>
+      </w:r>
+    </w:p>
+    <w:p>
+      <w:pPr>
+        <w:spacing w:after="20" w:before="20"/>
+        <w:ind w:left="567"/>
+      </w:pPr>
+      <w:r>
+        <w:rPr>
+          <w:rFonts w:ascii="Courier New" w:hAnsi="Courier New"/>
+          <w:color w:val="202020"/>
+          <w:sz w:val="18"/>
+        </w:rPr>
+        <w:t xml:space="preserve">    |-- criptografia.py          &lt;- Ferramenta 7 (ponto de entrada standalone)</w:t>
+      </w:r>
+    </w:p>
+    <w:p>
+      <w:pPr>
+        <w:spacing w:after="20" w:before="20"/>
+        <w:ind w:left="567"/>
+      </w:pPr>
+      <w:r>
+        <w:rPr>
+          <w:rFonts w:ascii="Courier New" w:hAnsi="Courier New"/>
+          <w:color w:val="202020"/>
+          <w:sz w:val="18"/>
+        </w:rPr>
+        <w:t xml:space="preserve">    |-- gui.py                   &lt;- Interface grafica do criptografador</w:t>
+      </w:r>
+    </w:p>
+    <w:p>
+      <w:pPr>
+        <w:spacing w:after="20" w:before="20"/>
+        <w:ind w:left="567"/>
+      </w:pPr>
+      <w:r>
+        <w:rPr>
+          <w:rFonts w:ascii="Courier New" w:hAnsi="Courier New"/>
+          <w:color w:val="202020"/>
+          <w:sz w:val="18"/>
+        </w:rPr>
+        <w:t xml:space="preserve">    |-- crypto.py                &lt;- Logica de criptografia (AES-256-GCM)</w:t>
+      </w:r>
+    </w:p>
+    <w:p>
+      <w:pPr>
+        <w:spacing w:after="20" w:before="20"/>
+        <w:ind w:left="567"/>
+      </w:pPr>
+      <w:r>
+        <w:rPr>
+          <w:rFonts w:ascii="Courier New" w:hAnsi="Courier New"/>
+          <w:color w:val="202020"/>
+          <w:sz w:val="18"/>
+        </w:rPr>
+        <w:t xml:space="preserve">    |-- html_builder.py          &lt;- Gerador do HTML autocontido</w:t>
       </w:r>
     </w:p>
     <w:p/>
@@ -518,7 +1030,7 @@
           <w:rFonts w:ascii="Calibri" w:hAnsi="Calibri"/>
           <w:sz w:val="22"/>
         </w:rPr>
-        <w:t>Cada ferramenta cria automaticamente tres subpastas ao ser executada:</w:t>
+        <w:t>Cada ferramenta (1-6) cria automaticamente tres subpastas ao ser executada:</w:t>
       </w:r>
     </w:p>
     <w:tbl>
@@ -681,7 +1193,7 @@
           <w:color w:val="1F3564"/>
           <w:sz w:val="32"/>
         </w:rPr>
-        <w:t>3. Fluxo de Uso</w:t>
+        <w:t>3. Fluxo de Uso (Ferramentas 1-6)</w:t>
       </w:r>
     </w:p>
     <w:p>
@@ -776,6 +1288,18 @@
       </w:r>
     </w:p>
     <w:p/>
+    <w:p>
+      <w:pPr>
+        <w:spacing w:after="120"/>
+      </w:pPr>
+      <w:r>
+        <w:rPr>
+          <w:rFonts w:ascii="Calibri" w:hAnsi="Calibri"/>
+          <w:sz w:val="22"/>
+        </w:rPr>
+        <w:t>Ferramenta 7 (Criptografar): abre uma janela propria dentro do hub com interface dedicada.</w:t>
+      </w:r>
+    </w:p>
     <w:p>
       <w:pPr>
         <w:spacing w:before="360" w:after="120"/>
@@ -1006,7 +1530,7 @@
           <w:rFonts w:ascii="Calibri" w:hAnsi="Calibri"/>
           <w:sz w:val="22"/>
         </w:rPr>
-        <w:t>Identifica as colunas de latitude e longitude por nome (latitude, lat, y, longitude, lon, lng, x) ou por faixa de valores numericos quando os nomes nao sao padrao.</w:t>
+        <w:t>Identifica colunas de latitude e longitude por nome (latitude, lat, y, longitude, lon, lng, x) ou por faixa de valores.</w:t>
       </w:r>
     </w:p>
     <w:p>
@@ -1019,7 +1543,7 @@
           <w:rFonts w:ascii="Calibri" w:hAnsi="Calibri"/>
           <w:sz w:val="22"/>
         </w:rPr>
-        <w:t>Usa a API Nominatim (OpenStreetMap) com RateLimiter (minimo 1,2 s entre requisicoes) para respeitar os limites da API gratuita.</w:t>
+        <w:t>Usa a API Nominatim com RateLimiter (minimo 1,2 s entre requisicoes) para respeitar os limites da API gratuita.</w:t>
       </w:r>
     </w:p>
     <w:p>
@@ -1032,7 +1556,7 @@
           <w:rFonts w:ascii="Calibri" w:hAnsi="Calibri"/>
           <w:sz w:val="22"/>
         </w:rPr>
-        <w:t>Mantem cache local (cache_enderecos.json) — coordenadas ja consultadas nao sao buscadas novamente, poupando tempo em reprocessamentos. O instalador ja inclui um cache pre-preenchido com enderecos ja conhecidos.</w:t>
+        <w:t>Mantem cache local (cache_enderecos.json) — coordenadas ja consultadas nao sao buscadas novamente. O instalador inclui cache pre-preenchido.</w:t>
       </w:r>
     </w:p>
     <w:p>
@@ -1072,7 +1596,7 @@
           <w:color w:val="1F3564"/>
           <w:sz w:val="24"/>
         </w:rPr>
-        <w:t>Colunas adicionadas ao arquivo de saida</w:t>
+        <w:t>Colunas adicionadas</w:t>
       </w:r>
     </w:p>
     <w:tbl>
@@ -1392,137 +1916,6 @@
           <w:color w:val="1F3564"/>
           <w:sz w:val="24"/>
         </w:rPr>
-        <w:t>Arquivos aceitos</w:t>
-      </w:r>
-    </w:p>
-    <w:tbl>
-      <w:tblPr>
-        <w:tblStyle w:val="TableGrid"/>
-        <w:tblW w:type="auto" w:w="0"/>
-        <w:jc w:val="left"/>
-        <w:tblLook w:firstColumn="1" w:firstRow="1" w:lastColumn="0" w:lastRow="0" w:noHBand="0" w:noVBand="1" w:val="04A0"/>
-      </w:tblPr>
-      <w:tblGrid>
-        <w:gridCol w:w="4561"/>
-        <w:gridCol w:w="4561"/>
-      </w:tblGrid>
-      <w:tr>
-        <w:tc>
-          <w:tcPr>
-            <w:tcW w:type="dxa" w:w="4535"/>
-            <w:shd w:val="clear" w:color="auto" w:fill="FF8C00"/>
-          </w:tcPr>
-          <w:p>
-            <w:r>
-              <w:rPr>
-                <w:rFonts w:ascii="Calibri" w:hAnsi="Calibri"/>
-                <w:b/>
-                <w:color w:val="FFFFFF"/>
-                <w:sz w:val="20"/>
-              </w:rPr>
-              <w:t>Formato</w:t>
-            </w:r>
-          </w:p>
-        </w:tc>
-        <w:tc>
-          <w:tcPr>
-            <w:tcW w:type="dxa" w:w="3969"/>
-            <w:shd w:val="clear" w:color="auto" w:fill="FF8C00"/>
-          </w:tcPr>
-          <w:p>
-            <w:r>
-              <w:rPr>
-                <w:rFonts w:ascii="Calibri" w:hAnsi="Calibri"/>
-                <w:b/>
-                <w:color w:val="FFFFFF"/>
-                <w:sz w:val="20"/>
-              </w:rPr>
-              <w:t>Extensao</w:t>
-            </w:r>
-          </w:p>
-        </w:tc>
-      </w:tr>
-      <w:tr>
-        <w:tc>
-          <w:tcPr>
-            <w:tcW w:type="dxa" w:w="4535"/>
-            <w:shd w:val="clear" w:color="auto" w:fill="F5F5F5"/>
-          </w:tcPr>
-          <w:p>
-            <w:r>
-              <w:rPr>
-                <w:rFonts w:ascii="Calibri" w:hAnsi="Calibri"/>
-                <w:sz w:val="20"/>
-              </w:rPr>
-              <w:t>Planilha Excel</w:t>
-            </w:r>
-          </w:p>
-        </w:tc>
-        <w:tc>
-          <w:tcPr>
-            <w:tcW w:type="dxa" w:w="3969"/>
-            <w:shd w:val="clear" w:color="auto" w:fill="F5F5F5"/>
-          </w:tcPr>
-          <w:p>
-            <w:r>
-              <w:rPr>
-                <w:rFonts w:ascii="Calibri" w:hAnsi="Calibri"/>
-                <w:sz w:val="20"/>
-              </w:rPr>
-              <w:t>.xlsx, .xls</w:t>
-            </w:r>
-          </w:p>
-        </w:tc>
-      </w:tr>
-      <w:tr>
-        <w:tc>
-          <w:tcPr>
-            <w:tcW w:type="dxa" w:w="4535"/>
-            <w:shd w:val="clear" w:color="auto" w:fill="FFFFFF"/>
-          </w:tcPr>
-          <w:p>
-            <w:r>
-              <w:rPr>
-                <w:rFonts w:ascii="Calibri" w:hAnsi="Calibri"/>
-                <w:sz w:val="20"/>
-              </w:rPr>
-              <w:t>CSV (separadores ; ou ,)</w:t>
-            </w:r>
-          </w:p>
-        </w:tc>
-        <w:tc>
-          <w:tcPr>
-            <w:tcW w:type="dxa" w:w="3969"/>
-            <w:shd w:val="clear" w:color="auto" w:fill="FFFFFF"/>
-          </w:tcPr>
-          <w:p>
-            <w:r>
-              <w:rPr>
-                <w:rFonts w:ascii="Calibri" w:hAnsi="Calibri"/>
-                <w:sz w:val="20"/>
-              </w:rPr>
-              <w:t>.csv</w:t>
-            </w:r>
-          </w:p>
-        </w:tc>
-      </w:tr>
-    </w:tbl>
-    <w:p>
-      <w:pPr>
-        <w:spacing w:after="80"/>
-      </w:pPr>
-    </w:p>
-    <w:p>
-      <w:pPr>
-        <w:spacing w:before="240" w:after="120"/>
-      </w:pPr>
-      <w:r>
-        <w:rPr>
-          <w:rFonts w:ascii="Calibri" w:hAnsi="Calibri"/>
-          <w:b/>
-          <w:color w:val="1F3564"/>
-          <w:sz w:val="24"/>
-        </w:rPr>
         <w:t>Como processa</w:t>
       </w:r>
     </w:p>
@@ -1575,7 +1968,7 @@
           <w:rFonts w:ascii="Calibri" w:hAnsi="Calibri"/>
           <w:sz w:val="22"/>
         </w:rPr>
-        <w:t>Aplica capitalizacao inteligente nas colunas de Titulo (pos. 1), Endereco (pos. 6) e Bairro (pos. 14) — artigos "da", "de", "do" ficam em minusculo.</w:t>
+        <w:t>Aplica capitalizacao inteligente — artigos "da", "de", "do" ficam em minusculo.</w:t>
       </w:r>
     </w:p>
     <w:p>
@@ -1602,19 +1995,6 @@
           <w:sz w:val="22"/>
         </w:rPr>
         <w:t>Valida endereco e bairro via Nominatim para obter o nome oficial do logradouro em Niteroi/RJ.</w:t>
-      </w:r>
-    </w:p>
-    <w:p>
-      <w:pPr>
-        <w:pStyle w:val="ListBullet"/>
-        <w:spacing w:after="60"/>
-      </w:pPr>
-      <w:r>
-        <w:rPr>
-          <w:rFonts w:ascii="Calibri" w:hAnsi="Calibri"/>
-          <w:sz w:val="22"/>
-        </w:rPr>
-        <w:t>Detecta corrupcao residual ao final, alertando colunas com padroes suspeitos.</w:t>
       </w:r>
     </w:p>
     <w:p>
@@ -1806,7 +2186,7 @@
           <w:rFonts w:ascii="Calibri" w:hAnsi="Calibri"/>
           <w:sz w:val="22"/>
         </w:rPr>
-        <w:t>Converte arquivos .txt de posicao fixa exportados pelo sistema do DETRAN/RJ em planilhas Excel estruturadas e legiveis, extraindo cada campo pela sua posicao exata no layout do arquivo.</w:t>
+        <w:t>Converte arquivos .txt de posicao fixa exportados pelo sistema do DETRAN/RJ em planilhas Excel estruturadas e legiveis, extraindo cada campo pela sua posicao exata no layout do arquivo. Cria tambem uma coluna "Descricao sem Numero" com o logradouro limpo (sem numero, sem sufixos OP., OPOSTO) logo apos a coluna original.</w:t>
       </w:r>
     </w:p>
     <w:p>
@@ -1820,106 +2200,7 @@
           <w:color w:val="1F3564"/>
           <w:sz w:val="24"/>
         </w:rPr>
-        <w:t>Arquivos aceitos</w:t>
-      </w:r>
-    </w:p>
-    <w:tbl>
-      <w:tblPr>
-        <w:tblStyle w:val="TableGrid"/>
-        <w:tblW w:type="auto" w:w="0"/>
-        <w:jc w:val="left"/>
-        <w:tblLook w:firstColumn="1" w:firstRow="1" w:lastColumn="0" w:lastRow="0" w:noHBand="0" w:noVBand="1" w:val="04A0"/>
-      </w:tblPr>
-      <w:tblGrid>
-        <w:gridCol w:w="4561"/>
-        <w:gridCol w:w="4561"/>
-      </w:tblGrid>
-      <w:tr>
-        <w:tc>
-          <w:tcPr>
-            <w:tcW w:type="dxa" w:w="5669"/>
-            <w:shd w:val="clear" w:color="auto" w:fill="FF8C00"/>
-          </w:tcPr>
-          <w:p>
-            <w:r>
-              <w:rPr>
-                <w:rFonts w:ascii="Calibri" w:hAnsi="Calibri"/>
-                <w:b/>
-                <w:color w:val="FFFFFF"/>
-                <w:sz w:val="20"/>
-              </w:rPr>
-              <w:t>Formato</w:t>
-            </w:r>
-          </w:p>
-        </w:tc>
-        <w:tc>
-          <w:tcPr>
-            <w:tcW w:type="dxa" w:w="2835"/>
-            <w:shd w:val="clear" w:color="auto" w:fill="FF8C00"/>
-          </w:tcPr>
-          <w:p>
-            <w:r>
-              <w:rPr>
-                <w:rFonts w:ascii="Calibri" w:hAnsi="Calibri"/>
-                <w:b/>
-                <w:color w:val="FFFFFF"/>
-                <w:sz w:val="20"/>
-              </w:rPr>
-              <w:t>Extensao</w:t>
-            </w:r>
-          </w:p>
-        </w:tc>
-      </w:tr>
-      <w:tr>
-        <w:tc>
-          <w:tcPr>
-            <w:tcW w:type="dxa" w:w="5669"/>
-            <w:shd w:val="clear" w:color="auto" w:fill="F5F5F5"/>
-          </w:tcPr>
-          <w:p>
-            <w:r>
-              <w:rPr>
-                <w:rFonts w:ascii="Calibri" w:hAnsi="Calibri"/>
-                <w:sz w:val="20"/>
-              </w:rPr>
-              <w:t>Arquivo de texto posicional (layout fixo)</w:t>
-            </w:r>
-          </w:p>
-        </w:tc>
-        <w:tc>
-          <w:tcPr>
-            <w:tcW w:type="dxa" w:w="2835"/>
-            <w:shd w:val="clear" w:color="auto" w:fill="F5F5F5"/>
-          </w:tcPr>
-          <w:p>
-            <w:r>
-              <w:rPr>
-                <w:rFonts w:ascii="Calibri" w:hAnsi="Calibri"/>
-                <w:sz w:val="20"/>
-              </w:rPr>
-              <w:t>.txt</w:t>
-            </w:r>
-          </w:p>
-        </w:tc>
-      </w:tr>
-    </w:tbl>
-    <w:p>
-      <w:pPr>
-        <w:spacing w:after="80"/>
-      </w:pPr>
-    </w:p>
-    <w:p>
-      <w:pPr>
-        <w:spacing w:before="240" w:after="120"/>
-      </w:pPr>
-      <w:r>
-        <w:rPr>
-          <w:rFonts w:ascii="Calibri" w:hAnsi="Calibri"/>
-          <w:b/>
-          <w:color w:val="1F3564"/>
-          <w:sz w:val="24"/>
-        </w:rPr>
-        <w:t>Layout do arquivo — campos por posicao de caractere</w:t>
+        <w:t>Layout — campos por posicao de caractere</w:t>
       </w:r>
     </w:p>
     <w:tbl>
@@ -2237,7 +2518,7 @@
                 <w:rFonts w:ascii="Calibri" w:hAnsi="Calibri"/>
                 <w:sz w:val="20"/>
               </w:rPr>
-              <w:t>167 - 174</w:t>
+              <w:t>174 - 181</w:t>
             </w:r>
           </w:p>
         </w:tc>
@@ -2252,135 +2533,7 @@
                 <w:rFonts w:ascii="Calibri" w:hAnsi="Calibri"/>
                 <w:sz w:val="20"/>
               </w:rPr>
-              <w:t>Situacao</w:t>
-            </w:r>
-          </w:p>
-        </w:tc>
-      </w:tr>
-      <w:tr>
-        <w:tc>
-          <w:tcPr>
-            <w:tcW w:type="dxa" w:w="2268"/>
-            <w:shd w:val="clear" w:color="auto" w:fill="FFFFFF"/>
-          </w:tcPr>
-          <w:p>
-            <w:r>
-              <w:rPr>
-                <w:rFonts w:ascii="Calibri" w:hAnsi="Calibri"/>
-                <w:sz w:val="20"/>
-              </w:rPr>
-              <w:t>174 - 181</w:t>
-            </w:r>
-          </w:p>
-        </w:tc>
-        <w:tc>
-          <w:tcPr>
-            <w:tcW w:type="dxa" w:w="6236"/>
-            <w:shd w:val="clear" w:color="auto" w:fill="FFFFFF"/>
-          </w:tcPr>
-          <w:p>
-            <w:r>
-              <w:rPr>
-                <w:rFonts w:ascii="Calibri" w:hAnsi="Calibri"/>
-                <w:sz w:val="20"/>
-              </w:rPr>
               <w:t>Placa do Veiculo</w:t>
-            </w:r>
-          </w:p>
-        </w:tc>
-      </w:tr>
-      <w:tr>
-        <w:tc>
-          <w:tcPr>
-            <w:tcW w:type="dxa" w:w="2268"/>
-            <w:shd w:val="clear" w:color="auto" w:fill="F5F5F5"/>
-          </w:tcPr>
-          <w:p>
-            <w:r>
-              <w:rPr>
-                <w:rFonts w:ascii="Calibri" w:hAnsi="Calibri"/>
-                <w:sz w:val="20"/>
-              </w:rPr>
-              <w:t>181 - 192</w:t>
-            </w:r>
-          </w:p>
-        </w:tc>
-        <w:tc>
-          <w:tcPr>
-            <w:tcW w:type="dxa" w:w="6236"/>
-            <w:shd w:val="clear" w:color="auto" w:fill="F5F5F5"/>
-          </w:tcPr>
-          <w:p>
-            <w:r>
-              <w:rPr>
-                <w:rFonts w:ascii="Calibri" w:hAnsi="Calibri"/>
-                <w:sz w:val="20"/>
-              </w:rPr>
-              <w:t>Renavam</w:t>
-            </w:r>
-          </w:p>
-        </w:tc>
-      </w:tr>
-      <w:tr>
-        <w:tc>
-          <w:tcPr>
-            <w:tcW w:type="dxa" w:w="2268"/>
-            <w:shd w:val="clear" w:color="auto" w:fill="FFFFFF"/>
-          </w:tcPr>
-          <w:p>
-            <w:r>
-              <w:rPr>
-                <w:rFonts w:ascii="Calibri" w:hAnsi="Calibri"/>
-                <w:sz w:val="20"/>
-              </w:rPr>
-              <w:t>192 - 217</w:t>
-            </w:r>
-          </w:p>
-        </w:tc>
-        <w:tc>
-          <w:tcPr>
-            <w:tcW w:type="dxa" w:w="6236"/>
-            <w:shd w:val="clear" w:color="auto" w:fill="FFFFFF"/>
-          </w:tcPr>
-          <w:p>
-            <w:r>
-              <w:rPr>
-                <w:rFonts w:ascii="Calibri" w:hAnsi="Calibri"/>
-                <w:sz w:val="20"/>
-              </w:rPr>
-              <w:t>Marca/Modelo</w:t>
-            </w:r>
-          </w:p>
-        </w:tc>
-      </w:tr>
-      <w:tr>
-        <w:tc>
-          <w:tcPr>
-            <w:tcW w:type="dxa" w:w="2268"/>
-            <w:shd w:val="clear" w:color="auto" w:fill="F5F5F5"/>
-          </w:tcPr>
-          <w:p>
-            <w:r>
-              <w:rPr>
-                <w:rFonts w:ascii="Calibri" w:hAnsi="Calibri"/>
-                <w:sz w:val="20"/>
-              </w:rPr>
-              <w:t>219 - 233</w:t>
-            </w:r>
-          </w:p>
-        </w:tc>
-        <w:tc>
-          <w:tcPr>
-            <w:tcW w:type="dxa" w:w="6236"/>
-            <w:shd w:val="clear" w:color="auto" w:fill="F5F5F5"/>
-          </w:tcPr>
-          <w:p>
-            <w:r>
-              <w:rPr>
-                <w:rFonts w:ascii="Calibri" w:hAnsi="Calibri"/>
-                <w:sz w:val="20"/>
-              </w:rPr>
-              <w:t>CPF/Identidade</w:t>
             </w:r>
           </w:p>
         </w:tc>
@@ -2461,7 +2614,7 @@
                 <w:rFonts w:ascii="Calibri" w:hAnsi="Calibri"/>
                 <w:sz w:val="20"/>
               </w:rPr>
-              <w:t>337 - 345</w:t>
+              <w:t>388 +</w:t>
             </w:r>
           </w:p>
         </w:tc>
@@ -2476,7 +2629,135 @@
                 <w:rFonts w:ascii="Calibri" w:hAnsi="Calibri"/>
                 <w:sz w:val="20"/>
               </w:rPr>
-              <w:t>CEP</w:t>
+              <w:t>Descricao do Municipio do Endereco + coluna extra sem numero</w:t>
+            </w:r>
+          </w:p>
+        </w:tc>
+      </w:tr>
+    </w:tbl>
+    <w:p>
+      <w:pPr>
+        <w:spacing w:after="80"/>
+      </w:pPr>
+    </w:p>
+    <w:p>
+      <w:pPr>
+        <w:spacing w:before="240" w:after="120"/>
+      </w:pPr>
+      <w:r>
+        <w:rPr>
+          <w:rFonts w:ascii="Calibri" w:hAnsi="Calibri"/>
+          <w:b/>
+          <w:color w:val="FF8C00"/>
+          <w:sz w:val="26"/>
+        </w:rPr>
+        <w:t>4.4  Organizador Detran Limpo</w:t>
+      </w:r>
+    </w:p>
+    <w:p>
+      <w:pPr>
+        <w:spacing w:after="120"/>
+      </w:pPr>
+      <w:r>
+        <w:rPr>
+          <w:rFonts w:ascii="Calibri" w:hAnsi="Calibri"/>
+          <w:b/>
+          <w:sz w:val="22"/>
+        </w:rPr>
+        <w:t xml:space="preserve">Arquivo: </w:t>
+      </w:r>
+      <w:r>
+        <w:rPr>
+          <w:rFonts w:ascii="Calibri" w:hAnsi="Calibri"/>
+          <w:b w:val="0"/>
+          <w:sz w:val="22"/>
+        </w:rPr>
+        <w:t>DetranLimpo/detranLimpo.py</w:t>
+      </w:r>
+    </w:p>
+    <w:p>
+      <w:pPr>
+        <w:spacing w:before="240" w:after="120"/>
+      </w:pPr>
+      <w:r>
+        <w:rPr>
+          <w:rFonts w:ascii="Calibri" w:hAnsi="Calibri"/>
+          <w:b/>
+          <w:color w:val="1F3564"/>
+          <w:sz w:val="24"/>
+        </w:rPr>
+        <w:t>O que faz</w:t>
+      </w:r>
+    </w:p>
+    <w:p>
+      <w:pPr>
+        <w:spacing w:after="120"/>
+      </w:pPr>
+      <w:r>
+        <w:rPr>
+          <w:rFonts w:ascii="Calibri" w:hAnsi="Calibri"/>
+          <w:sz w:val="22"/>
+        </w:rPr>
+        <w:t>Recebe planilhas Excel (por exemplo, a saida do Organizador TXT Detran ou arquivos exportados diretamente do sistema Detran/GAIDE) que contenham uma coluna de endereco e cria ou atualiza uma coluna "Rua" com o logradouro limpo, sem numero e sem referencias de cruzamento ou sufixos de posicao.</w:t>
+      </w:r>
+    </w:p>
+    <w:p>
+      <w:pPr>
+        <w:spacing w:before="240" w:after="120"/>
+      </w:pPr>
+      <w:r>
+        <w:rPr>
+          <w:rFonts w:ascii="Calibri" w:hAnsi="Calibri"/>
+          <w:b/>
+          <w:color w:val="1F3564"/>
+          <w:sz w:val="24"/>
+        </w:rPr>
+        <w:t>Arquivos aceitos</w:t>
+      </w:r>
+    </w:p>
+    <w:tbl>
+      <w:tblPr>
+        <w:tblStyle w:val="TableGrid"/>
+        <w:tblW w:type="auto" w:w="0"/>
+        <w:jc w:val="left"/>
+        <w:tblLook w:firstColumn="1" w:firstRow="1" w:lastColumn="0" w:lastRow="0" w:noHBand="0" w:noVBand="1" w:val="04A0"/>
+      </w:tblPr>
+      <w:tblGrid>
+        <w:gridCol w:w="4561"/>
+        <w:gridCol w:w="4561"/>
+      </w:tblGrid>
+      <w:tr>
+        <w:tc>
+          <w:tcPr>
+            <w:tcW w:type="dxa" w:w="4535"/>
+            <w:shd w:val="clear" w:color="auto" w:fill="FF8C00"/>
+          </w:tcPr>
+          <w:p>
+            <w:r>
+              <w:rPr>
+                <w:rFonts w:ascii="Calibri" w:hAnsi="Calibri"/>
+                <w:b/>
+                <w:color w:val="FFFFFF"/>
+                <w:sz w:val="20"/>
+              </w:rPr>
+              <w:t>Formato</w:t>
+            </w:r>
+          </w:p>
+        </w:tc>
+        <w:tc>
+          <w:tcPr>
+            <w:tcW w:type="dxa" w:w="3969"/>
+            <w:shd w:val="clear" w:color="auto" w:fill="FF8C00"/>
+          </w:tcPr>
+          <w:p>
+            <w:r>
+              <w:rPr>
+                <w:rFonts w:ascii="Calibri" w:hAnsi="Calibri"/>
+                <w:b/>
+                <w:color w:val="FFFFFF"/>
+                <w:sz w:val="20"/>
+              </w:rPr>
+              <w:t>Extensao</w:t>
             </w:r>
           </w:p>
         </w:tc>
@@ -2484,7 +2765,7 @@
       <w:tr>
         <w:tc>
           <w:tcPr>
-            <w:tcW w:type="dxa" w:w="2268"/>
+            <w:tcW w:type="dxa" w:w="4535"/>
             <w:shd w:val="clear" w:color="auto" w:fill="F5F5F5"/>
           </w:tcPr>
           <w:p>
@@ -2493,13 +2774,13 @@
                 <w:rFonts w:ascii="Calibri" w:hAnsi="Calibri"/>
                 <w:sz w:val="20"/>
               </w:rPr>
-              <w:t>345 - 388</w:t>
+              <w:t>Planilha Excel</w:t>
             </w:r>
           </w:p>
         </w:tc>
         <w:tc>
           <w:tcPr>
-            <w:tcW w:type="dxa" w:w="6236"/>
+            <w:tcW w:type="dxa" w:w="3969"/>
             <w:shd w:val="clear" w:color="auto" w:fill="F5F5F5"/>
           </w:tcPr>
           <w:p>
@@ -2508,7 +2789,39 @@
                 <w:rFonts w:ascii="Calibri" w:hAnsi="Calibri"/>
                 <w:sz w:val="20"/>
               </w:rPr>
-              <w:t>Municipio</w:t>
+              <w:t>.xlsx, .xls</w:t>
+            </w:r>
+          </w:p>
+        </w:tc>
+      </w:tr>
+      <w:tr>
+        <w:tc>
+          <w:tcPr>
+            <w:tcW w:type="dxa" w:w="4535"/>
+            <w:shd w:val="clear" w:color="auto" w:fill="FFFFFF"/>
+          </w:tcPr>
+          <w:p>
+            <w:r>
+              <w:rPr>
+                <w:rFonts w:ascii="Calibri" w:hAnsi="Calibri"/>
+                <w:sz w:val="20"/>
+              </w:rPr>
+              <w:t>CSV</w:t>
+            </w:r>
+          </w:p>
+        </w:tc>
+        <w:tc>
+          <w:tcPr>
+            <w:tcW w:type="dxa" w:w="3969"/>
+            <w:shd w:val="clear" w:color="auto" w:fill="FFFFFF"/>
+          </w:tcPr>
+          <w:p>
+            <w:r>
+              <w:rPr>
+                <w:rFonts w:ascii="Calibri" w:hAnsi="Calibri"/>
+                <w:sz w:val="20"/>
+              </w:rPr>
+              <w:t>.csv</w:t>
             </w:r>
           </w:p>
         </w:tc>
@@ -2530,7 +2843,86 @@
           <w:color w:val="1F3564"/>
           <w:sz w:val="24"/>
         </w:rPr>
-        <w:t>Saida gerada</w:t>
+        <w:t>Regras de limpeza</w:t>
+      </w:r>
+    </w:p>
+    <w:p>
+      <w:pPr>
+        <w:pStyle w:val="ListBullet"/>
+        <w:spacing w:after="60"/>
+      </w:pPr>
+      <w:r>
+        <w:rPr>
+          <w:rFonts w:ascii="Calibri" w:hAnsi="Calibri"/>
+          <w:sz w:val="22"/>
+        </w:rPr>
+        <w:t>Remove numero do final do endereco: "AV. BRASIL 341" -&gt; "AV. BRASIL".</w:t>
+      </w:r>
+    </w:p>
+    <w:p>
+      <w:pPr>
+        <w:pStyle w:val="ListBullet"/>
+        <w:spacing w:after="60"/>
+      </w:pPr>
+      <w:r>
+        <w:rPr>
+          <w:rFonts w:ascii="Calibri" w:hAnsi="Calibri"/>
+          <w:sz w:val="22"/>
+        </w:rPr>
+        <w:t>Remove "N" abreviado de numero: "RUA BARAO DO AMAZONAS N 340" -&gt; "RUA BARAO DO AMAZONAS".</w:t>
+      </w:r>
+    </w:p>
+    <w:p>
+      <w:pPr>
+        <w:pStyle w:val="ListBullet"/>
+        <w:spacing w:after="60"/>
+      </w:pPr>
+      <w:r>
+        <w:rPr>
+          <w:rFonts w:ascii="Calibri" w:hAnsi="Calibri"/>
+          <w:sz w:val="22"/>
+        </w:rPr>
+        <w:t>Remove sufixos de posicao: OP., OP. OP., OPOSTO, LADO OP.</w:t>
+      </w:r>
+    </w:p>
+    <w:p>
+      <w:pPr>
+        <w:pStyle w:val="ListBullet"/>
+        <w:spacing w:after="60"/>
+      </w:pPr>
+      <w:r>
+        <w:rPr>
+          <w:rFonts w:ascii="Calibri" w:hAnsi="Calibri"/>
+          <w:sz w:val="22"/>
+        </w:rPr>
+        <w:t>Remove referencias de cruzamento: "COM RUA SAO PEDRO", "C/ R. BARAO...", "CRUZAMENTO COM...".</w:t>
+      </w:r>
+    </w:p>
+    <w:p>
+      <w:pPr>
+        <w:pStyle w:val="ListBullet"/>
+        <w:spacing w:after="60"/>
+      </w:pPr>
+      <w:r>
+        <w:rPr>
+          <w:rFonts w:ascii="Calibri" w:hAnsi="Calibri"/>
+          <w:sz w:val="22"/>
+        </w:rPr>
+        <w:t>Reconhece faixas de numeros: "151 AO 251" e remove o intervalo inteiro.</w:t>
+      </w:r>
+    </w:p>
+    <w:p>
+      <w:pPr>
+        <w:spacing w:before="240" w:after="120"/>
+      </w:pPr>
+      <w:r>
+        <w:rPr>
+          <w:rFonts w:ascii="Calibri" w:hAnsi="Calibri"/>
+          <w:b/>
+          <w:color w:val="1F3564"/>
+          <w:sz w:val="24"/>
+        </w:rPr>
+        <w:t>Comportamento da coluna Rua</w:t>
       </w:r>
     </w:p>
     <w:tbl>
@@ -2558,7 +2950,7 @@
                 <w:color w:val="FFFFFF"/>
                 <w:sz w:val="20"/>
               </w:rPr>
-              <w:t>Arquivo</w:t>
+              <w:t>Situacao</w:t>
             </w:r>
           </w:p>
         </w:tc>
@@ -2575,7 +2967,7 @@
                 <w:color w:val="FFFFFF"/>
                 <w:sz w:val="20"/>
               </w:rPr>
-              <w:t>Conteudo</w:t>
+              <w:t>Acao</w:t>
             </w:r>
           </w:p>
         </w:tc>
@@ -2592,7 +2984,7 @@
                 <w:rFonts w:ascii="Calibri" w:hAnsi="Calibri"/>
                 <w:sz w:val="20"/>
               </w:rPr>
-              <w:t>{nome}_normalizado.xlsx</w:t>
+              <w:t>Coluna "Rua" nao existe</w:t>
             </w:r>
           </w:p>
         </w:tc>
@@ -2607,7 +2999,39 @@
                 <w:rFonts w:ascii="Calibri" w:hAnsi="Calibri"/>
                 <w:sz w:val="20"/>
               </w:rPr>
-              <w:t>Planilha com todos os campos em colunas separadas</w:t>
+              <w:t>Cria a coluna logo apos o campo de endereco</w:t>
+            </w:r>
+          </w:p>
+        </w:tc>
+      </w:tr>
+      <w:tr>
+        <w:tc>
+          <w:tcPr>
+            <w:tcW w:type="dxa" w:w="3402"/>
+            <w:shd w:val="clear" w:color="auto" w:fill="FFFFFF"/>
+          </w:tcPr>
+          <w:p>
+            <w:r>
+              <w:rPr>
+                <w:rFonts w:ascii="Calibri" w:hAnsi="Calibri"/>
+                <w:sz w:val="20"/>
+              </w:rPr>
+              <w:t>Coluna "Rua" existe (qualquer valor)</w:t>
+            </w:r>
+          </w:p>
+        </w:tc>
+        <w:tc>
+          <w:tcPr>
+            <w:tcW w:type="dxa" w:w="5102"/>
+            <w:shd w:val="clear" w:color="auto" w:fill="FFFFFF"/>
+          </w:tcPr>
+          <w:p>
+            <w:r>
+              <w:rPr>
+                <w:rFonts w:ascii="Calibri" w:hAnsi="Calibri"/>
+                <w:sz w:val="20"/>
+              </w:rPr>
+              <w:t>Sempre sobrescreve com o valor limpo da coluna de endereco</w:t>
             </w:r>
           </w:p>
         </w:tc>
@@ -2629,7 +3053,7 @@
           <w:color w:val="FF8C00"/>
           <w:sz w:val="26"/>
         </w:rPr>
-        <w:t>4.4  PDF e Excel Multas</w:t>
+        <w:t>4.5  PDF e Excel Multas</w:t>
       </w:r>
     </w:p>
     <w:p>
@@ -2690,105 +3114,6 @@
           <w:color w:val="1F3564"/>
           <w:sz w:val="24"/>
         </w:rPr>
-        <w:t>Arquivos aceitos</w:t>
-      </w:r>
-    </w:p>
-    <w:tbl>
-      <w:tblPr>
-        <w:tblStyle w:val="TableGrid"/>
-        <w:tblW w:type="auto" w:w="0"/>
-        <w:jc w:val="left"/>
-        <w:tblLook w:firstColumn="1" w:firstRow="1" w:lastColumn="0" w:lastRow="0" w:noHBand="0" w:noVBand="1" w:val="04A0"/>
-      </w:tblPr>
-      <w:tblGrid>
-        <w:gridCol w:w="4561"/>
-        <w:gridCol w:w="4561"/>
-      </w:tblGrid>
-      <w:tr>
-        <w:tc>
-          <w:tcPr>
-            <w:tcW w:type="dxa" w:w="5669"/>
-            <w:shd w:val="clear" w:color="auto" w:fill="FF8C00"/>
-          </w:tcPr>
-          <w:p>
-            <w:r>
-              <w:rPr>
-                <w:rFonts w:ascii="Calibri" w:hAnsi="Calibri"/>
-                <w:b/>
-                <w:color w:val="FFFFFF"/>
-                <w:sz w:val="20"/>
-              </w:rPr>
-              <w:t>Formato</w:t>
-            </w:r>
-          </w:p>
-        </w:tc>
-        <w:tc>
-          <w:tcPr>
-            <w:tcW w:type="dxa" w:w="2835"/>
-            <w:shd w:val="clear" w:color="auto" w:fill="FF8C00"/>
-          </w:tcPr>
-          <w:p>
-            <w:r>
-              <w:rPr>
-                <w:rFonts w:ascii="Calibri" w:hAnsi="Calibri"/>
-                <w:b/>
-                <w:color w:val="FFFFFF"/>
-                <w:sz w:val="20"/>
-              </w:rPr>
-              <w:t>Extensao</w:t>
-            </w:r>
-          </w:p>
-        </w:tc>
-      </w:tr>
-      <w:tr>
-        <w:tc>
-          <w:tcPr>
-            <w:tcW w:type="dxa" w:w="5669"/>
-            <w:shd w:val="clear" w:color="auto" w:fill="F5F5F5"/>
-          </w:tcPr>
-          <w:p>
-            <w:r>
-              <w:rPr>
-                <w:rFonts w:ascii="Calibri" w:hAnsi="Calibri"/>
-                <w:sz w:val="20"/>
-              </w:rPr>
-              <w:t>Relatorio PDF do sistema GAIDE</w:t>
-            </w:r>
-          </w:p>
-        </w:tc>
-        <w:tc>
-          <w:tcPr>
-            <w:tcW w:type="dxa" w:w="2835"/>
-            <w:shd w:val="clear" w:color="auto" w:fill="F5F5F5"/>
-          </w:tcPr>
-          <w:p>
-            <w:r>
-              <w:rPr>
-                <w:rFonts w:ascii="Calibri" w:hAnsi="Calibri"/>
-                <w:sz w:val="20"/>
-              </w:rPr>
-              <w:t>.pdf</w:t>
-            </w:r>
-          </w:p>
-        </w:tc>
-      </w:tr>
-    </w:tbl>
-    <w:p>
-      <w:pPr>
-        <w:spacing w:after="80"/>
-      </w:pPr>
-    </w:p>
-    <w:p>
-      <w:pPr>
-        <w:spacing w:before="240" w:after="120"/>
-      </w:pPr>
-      <w:r>
-        <w:rPr>
-          <w:rFonts w:ascii="Calibri" w:hAnsi="Calibri"/>
-          <w:b/>
-          <w:color w:val="1F3564"/>
-          <w:sz w:val="24"/>
-        </w:rPr>
         <w:t>Desafios do PDF e como sao tratados</w:t>
       </w:r>
     </w:p>
@@ -2802,7 +3127,7 @@
           <w:rFonts w:ascii="Calibri" w:hAnsi="Calibri"/>
           <w:sz w:val="22"/>
         </w:rPr>
-        <w:t>CNPJ quebrado em duas linhas (ex: 30.069.314/0001- + 01): reunificado antes da extracao.</w:t>
+        <w:t>CNPJ quebrado em duas linhas: reunificado antes da extracao.</w:t>
       </w:r>
     </w:p>
     <w:p>
@@ -2854,99 +3179,7 @@
           <w:rFonts w:ascii="Calibri" w:hAnsi="Calibri"/>
           <w:sz w:val="22"/>
         </w:rPr>
-        <w:t>Linhas de cabecalho e rodape (emissao, pagina, usuario, DETRAN) descartadas por regex.</w:t>
-      </w:r>
-    </w:p>
-    <w:p>
-      <w:pPr>
-        <w:spacing w:before="240" w:after="120"/>
-      </w:pPr>
-      <w:r>
-        <w:rPr>
-          <w:rFonts w:ascii="Calibri" w:hAnsi="Calibri"/>
-          <w:b/>
-          <w:color w:val="1F3564"/>
-          <w:sz w:val="24"/>
-        </w:rPr>
-        <w:t>Como processa</w:t>
-      </w:r>
-    </w:p>
-    <w:p>
-      <w:pPr>
-        <w:pStyle w:val="ListBullet"/>
-        <w:spacing w:after="60"/>
-      </w:pPr>
-      <w:r>
-        <w:rPr>
-          <w:rFonts w:ascii="Calibri" w:hAnsi="Calibri"/>
-          <w:sz w:val="22"/>
-        </w:rPr>
-        <w:t>Le todas as paginas do PDF com pdfplumber.</w:t>
-      </w:r>
-    </w:p>
-    <w:p>
-      <w:pPr>
-        <w:pStyle w:val="ListBullet"/>
-        <w:spacing w:after="60"/>
-      </w:pPr>
-      <w:r>
-        <w:rPr>
-          <w:rFonts w:ascii="Calibri" w:hAnsi="Calibri"/>
-          <w:sz w:val="22"/>
-        </w:rPr>
-        <w:t>Aplica as correcoes de quebra de linha em sequencia.</w:t>
-      </w:r>
-    </w:p>
-    <w:p>
-      <w:pPr>
-        <w:pStyle w:val="ListBullet"/>
-        <w:spacing w:after="60"/>
-      </w:pPr>
-      <w:r>
-        <w:rPr>
-          <w:rFonts w:ascii="Calibri" w:hAnsi="Calibri"/>
-          <w:sz w:val="22"/>
-        </w:rPr>
-        <w:t>Particiona o texto em blocos por registro — cada bloco inicia na linha onde aparece uma placa (formato AAA0A00 ou AAA0000).</w:t>
-      </w:r>
-    </w:p>
-    <w:p>
-      <w:pPr>
-        <w:pStyle w:val="ListBullet"/>
-        <w:spacing w:after="60"/>
-      </w:pPr>
-      <w:r>
-        <w:rPr>
-          <w:rFonts w:ascii="Calibri" w:hAnsi="Calibri"/>
-          <w:sz w:val="22"/>
-        </w:rPr>
-        <w:t>Extrai de cada bloco: CPF/CNPJ, Proprietario, Placa, Processo, Datas, Resultado e Relator.</w:t>
-      </w:r>
-    </w:p>
-    <w:p>
-      <w:pPr>
-        <w:pStyle w:val="ListBullet"/>
-        <w:spacing w:after="60"/>
-      </w:pPr>
-      <w:r>
-        <w:rPr>
-          <w:rFonts w:ascii="Calibri" w:hAnsi="Calibri"/>
-          <w:sz w:val="22"/>
-        </w:rPr>
-        <w:t>Propaga CPF/CNPJ para registros consecutivos do mesmo proprietario sem o campo explicito.</w:t>
-      </w:r>
-    </w:p>
-    <w:p>
-      <w:pPr>
-        <w:pStyle w:val="ListBullet"/>
-        <w:spacing w:after="60"/>
-      </w:pPr>
-      <w:r>
-        <w:rPr>
-          <w:rFonts w:ascii="Calibri" w:hAnsi="Calibri"/>
-          <w:sz w:val="22"/>
-        </w:rPr>
-        <w:t>Processa todos os PDFs da pasta entrada/ e consolida em um unico arquivo.</w:t>
+        <w:t>Linhas de cabecalho e rodape descartadas por regex.</w:t>
       </w:r>
     </w:p>
     <w:p>
@@ -3059,7 +3292,7 @@
           <w:color w:val="FF8C00"/>
           <w:sz w:val="26"/>
         </w:rPr>
-        <w:t>4.5  Processos Abertos</w:t>
+        <w:t>4.6  Processos Abertos</w:t>
       </w:r>
     </w:p>
     <w:p>
@@ -3107,235 +3340,6 @@
           <w:sz w:val="22"/>
         </w:rPr>
         <w:t>Le o relatorio "Relatorio de Processos Abertos - 1a. Instancia" exportado pelo sistema GAIDE/DETRAN em formato PDF e extrai todos os registros organizados por data de abertura, gerando uma planilha Excel estruturada.</w:t>
-      </w:r>
-    </w:p>
-    <w:p>
-      <w:pPr>
-        <w:spacing w:before="240" w:after="120"/>
-      </w:pPr>
-      <w:r>
-        <w:rPr>
-          <w:rFonts w:ascii="Calibri" w:hAnsi="Calibri"/>
-          <w:b/>
-          <w:color w:val="1F3564"/>
-          <w:sz w:val="24"/>
-        </w:rPr>
-        <w:t>Arquivos aceitos</w:t>
-      </w:r>
-    </w:p>
-    <w:tbl>
-      <w:tblPr>
-        <w:tblStyle w:val="TableGrid"/>
-        <w:tblW w:type="auto" w:w="0"/>
-        <w:jc w:val="left"/>
-        <w:tblLook w:firstColumn="1" w:firstRow="1" w:lastColumn="0" w:lastRow="0" w:noHBand="0" w:noVBand="1" w:val="04A0"/>
-      </w:tblPr>
-      <w:tblGrid>
-        <w:gridCol w:w="4561"/>
-        <w:gridCol w:w="4561"/>
-      </w:tblGrid>
-      <w:tr>
-        <w:tc>
-          <w:tcPr>
-            <w:tcW w:type="dxa" w:w="5669"/>
-            <w:shd w:val="clear" w:color="auto" w:fill="FF8C00"/>
-          </w:tcPr>
-          <w:p>
-            <w:r>
-              <w:rPr>
-                <w:rFonts w:ascii="Calibri" w:hAnsi="Calibri"/>
-                <w:b/>
-                <w:color w:val="FFFFFF"/>
-                <w:sz w:val="20"/>
-              </w:rPr>
-              <w:t>Formato</w:t>
-            </w:r>
-          </w:p>
-        </w:tc>
-        <w:tc>
-          <w:tcPr>
-            <w:tcW w:type="dxa" w:w="2835"/>
-            <w:shd w:val="clear" w:color="auto" w:fill="FF8C00"/>
-          </w:tcPr>
-          <w:p>
-            <w:r>
-              <w:rPr>
-                <w:rFonts w:ascii="Calibri" w:hAnsi="Calibri"/>
-                <w:b/>
-                <w:color w:val="FFFFFF"/>
-                <w:sz w:val="20"/>
-              </w:rPr>
-              <w:t>Extensao</w:t>
-            </w:r>
-          </w:p>
-        </w:tc>
-      </w:tr>
-      <w:tr>
-        <w:tc>
-          <w:tcPr>
-            <w:tcW w:type="dxa" w:w="5669"/>
-            <w:shd w:val="clear" w:color="auto" w:fill="F5F5F5"/>
-          </w:tcPr>
-          <w:p>
-            <w:r>
-              <w:rPr>
-                <w:rFonts w:ascii="Calibri" w:hAnsi="Calibri"/>
-                <w:sz w:val="20"/>
-              </w:rPr>
-              <w:t>Relatorio PDF - Processos Abertos 1a. Instancia (GAIDE/DETRAN)</w:t>
-            </w:r>
-          </w:p>
-        </w:tc>
-        <w:tc>
-          <w:tcPr>
-            <w:tcW w:type="dxa" w:w="2835"/>
-            <w:shd w:val="clear" w:color="auto" w:fill="F5F5F5"/>
-          </w:tcPr>
-          <w:p>
-            <w:r>
-              <w:rPr>
-                <w:rFonts w:ascii="Calibri" w:hAnsi="Calibri"/>
-                <w:sz w:val="20"/>
-              </w:rPr>
-              <w:t>.pdf</w:t>
-            </w:r>
-          </w:p>
-        </w:tc>
-      </w:tr>
-    </w:tbl>
-    <w:p>
-      <w:pPr>
-        <w:spacing w:after="80"/>
-      </w:pPr>
-    </w:p>
-    <w:p>
-      <w:pPr>
-        <w:spacing w:before="240" w:after="120"/>
-      </w:pPr>
-      <w:r>
-        <w:rPr>
-          <w:rFonts w:ascii="Calibri" w:hAnsi="Calibri"/>
-          <w:b/>
-          <w:color w:val="1F3564"/>
-          <w:sz w:val="24"/>
-        </w:rPr>
-        <w:t>Estrutura do relatorio PDF</w:t>
-      </w:r>
-    </w:p>
-    <w:p>
-      <w:pPr>
-        <w:spacing w:after="120"/>
-      </w:pPr>
-      <w:r>
-        <w:rPr>
-          <w:rFonts w:ascii="Calibri" w:hAnsi="Calibri"/>
-          <w:sz w:val="22"/>
-        </w:rPr>
-        <w:t>O relatorio agrupa os registros por data de abertura. Cada secao comeca com "DATA DE ABERTURA: DD/MM/AAAA" seguida de linhas no formato:</w:t>
-      </w:r>
-    </w:p>
-    <w:p>
-      <w:pPr>
-        <w:spacing w:after="20" w:before="20"/>
-        <w:ind w:left="567"/>
-      </w:pPr>
-      <w:r>
-        <w:rPr>
-          <w:rFonts w:ascii="Courier New" w:hAnsi="Courier New"/>
-          <w:color w:val="202020"/>
-          <w:sz w:val="18"/>
-        </w:rPr>
-        <w:t>SEQ   REQUERIMENTO   N. PROCESSO   N. AUTO   LOGIN</w:t>
-      </w:r>
-    </w:p>
-    <w:p>
-      <w:pPr>
-        <w:spacing w:after="120"/>
-      </w:pPr>
-      <w:r>
-        <w:rPr>
-          <w:rFonts w:ascii="Calibri" w:hAnsi="Calibri"/>
-          <w:sz w:val="22"/>
-        </w:rPr>
-      </w:r>
-    </w:p>
-    <w:p>
-      <w:pPr>
-        <w:spacing w:before="240" w:after="120"/>
-      </w:pPr>
-      <w:r>
-        <w:rPr>
-          <w:rFonts w:ascii="Calibri" w:hAnsi="Calibri"/>
-          <w:b/>
-          <w:color w:val="1F3564"/>
-          <w:sz w:val="24"/>
-        </w:rPr>
-        <w:t>Como processa</w:t>
-      </w:r>
-    </w:p>
-    <w:p>
-      <w:pPr>
-        <w:pStyle w:val="ListBullet"/>
-        <w:spacing w:after="60"/>
-      </w:pPr>
-      <w:r>
-        <w:rPr>
-          <w:rFonts w:ascii="Calibri" w:hAnsi="Calibri"/>
-          <w:sz w:val="22"/>
-        </w:rPr>
-        <w:t>Le todas as paginas do PDF com pdfplumber e extrai o texto linha a linha.</w:t>
-      </w:r>
-    </w:p>
-    <w:p>
-      <w:pPr>
-        <w:pStyle w:val="ListBullet"/>
-        <w:spacing w:after="60"/>
-      </w:pPr>
-      <w:r>
-        <w:rPr>
-          <w:rFonts w:ascii="Calibri" w:hAnsi="Calibri"/>
-          <w:sz w:val="22"/>
-        </w:rPr>
-        <w:t>Detecta a data de abertura de cada secao pela expressao "DATA DE ABERTURA: DD/MM/AAAA".</w:t>
-      </w:r>
-    </w:p>
-    <w:p>
-      <w:pPr>
-        <w:pStyle w:val="ListBullet"/>
-        <w:spacing w:after="60"/>
-      </w:pPr>
-      <w:r>
-        <w:rPr>
-          <w:rFonts w:ascii="Calibri" w:hAnsi="Calibri"/>
-          <w:sz w:val="22"/>
-        </w:rPr>
-        <w:t>Filtra linhas de cabecalho, rodape, paginacao e ruido por regex antes de tentar extrair dados.</w:t>
-      </w:r>
-    </w:p>
-    <w:p>
-      <w:pPr>
-        <w:pStyle w:val="ListBullet"/>
-        <w:spacing w:after="60"/>
-      </w:pPr>
-      <w:r>
-        <w:rPr>
-          <w:rFonts w:ascii="Calibri" w:hAnsi="Calibri"/>
-          <w:sz w:val="22"/>
-        </w:rPr>
-        <w:t>Cada linha de dado e validada pelo padrao: numero sequencial, tipo de requerimento (0P/1P/2C etc.), numero do processo, numero do auto (N...) e login do usuario.</w:t>
-      </w:r>
-    </w:p>
-    <w:p>
-      <w:pPr>
-        <w:pStyle w:val="ListBullet"/>
-        <w:spacing w:after="60"/>
-      </w:pPr>
-      <w:r>
-        <w:rPr>
-          <w:rFonts w:ascii="Calibri" w:hAnsi="Calibri"/>
-          <w:sz w:val="22"/>
-        </w:rPr>
-        <w:t>Move os PDFs processados para a pasta backup/ apos a extracao.</w:t>
       </w:r>
     </w:p>
     <w:p>
@@ -3637,10 +3641,516 @@
         <w:rPr>
           <w:rFonts w:ascii="Calibri" w:hAnsi="Calibri"/>
           <w:b/>
+          <w:color w:val="FF8C00"/>
+          <w:sz w:val="26"/>
+        </w:rPr>
+        <w:t>4.7  Criptografar Arquivos</w:t>
+      </w:r>
+    </w:p>
+    <w:p>
+      <w:pPr>
+        <w:spacing w:after="120"/>
+      </w:pPr>
+      <w:r>
+        <w:rPr>
+          <w:rFonts w:ascii="Calibri" w:hAnsi="Calibri"/>
+          <w:b/>
+          <w:sz w:val="22"/>
+        </w:rPr>
+        <w:t xml:space="preserve">Arquivos: </w:t>
+      </w:r>
+      <w:r>
+        <w:rPr>
+          <w:rFonts w:ascii="Calibri" w:hAnsi="Calibri"/>
+          <w:b w:val="0"/>
+          <w:sz w:val="22"/>
+        </w:rPr>
+        <w:t>Criptografia/crypto.py, html_builder.py, gui.py</w:t>
+      </w:r>
+    </w:p>
+    <w:p>
+      <w:pPr>
+        <w:spacing w:before="240" w:after="120"/>
+      </w:pPr>
+      <w:r>
+        <w:rPr>
+          <w:rFonts w:ascii="Calibri" w:hAnsi="Calibri"/>
+          <w:b/>
           <w:color w:val="1F3564"/>
           <w:sz w:val="24"/>
         </w:rPr>
-        <w:t>Saida gerada</w:t>
+        <w:t>O que faz</w:t>
+      </w:r>
+    </w:p>
+    <w:p>
+      <w:pPr>
+        <w:spacing w:after="120"/>
+      </w:pPr>
+      <w:r>
+        <w:rPr>
+          <w:rFonts w:ascii="Calibri" w:hAnsi="Calibri"/>
+          <w:sz w:val="22"/>
+        </w:rPr>
+        <w:t>Criptografa qualquer tipo de arquivo (Excel, PDF, Word, TXT) com uma senha definida pelo usuario e gera um arquivo HTML autocontido. O destinatario abre o HTML em qualquer navegador, digita a senha e o arquivo original e baixado ja descriptografado diretamente na maquina dele — sem passar por nenhum servidor.</w:t>
+      </w:r>
+    </w:p>
+    <w:p>
+      <w:pPr>
+        <w:spacing w:before="240" w:after="120"/>
+      </w:pPr>
+      <w:r>
+        <w:rPr>
+          <w:rFonts w:ascii="Calibri" w:hAnsi="Calibri"/>
+          <w:b/>
+          <w:color w:val="1F3564"/>
+          <w:sz w:val="24"/>
+        </w:rPr>
+        <w:t>Fluxo completo</w:t>
+      </w:r>
+    </w:p>
+    <w:p>
+      <w:pPr>
+        <w:pStyle w:val="ListBullet"/>
+        <w:spacing w:after="60"/>
+      </w:pPr>
+      <w:r>
+        <w:rPr>
+          <w:rFonts w:ascii="Calibri" w:hAnsi="Calibri"/>
+          <w:sz w:val="22"/>
+        </w:rPr>
+        <w:t>1. Usuario seleciona o arquivo e digita uma senha.</w:t>
+      </w:r>
+    </w:p>
+    <w:p>
+      <w:pPr>
+        <w:pStyle w:val="ListBullet"/>
+        <w:spacing w:after="60"/>
+      </w:pPr>
+      <w:r>
+        <w:rPr>
+          <w:rFonts w:ascii="Calibri" w:hAnsi="Calibri"/>
+          <w:sz w:val="22"/>
+        </w:rPr>
+        <w:t>2. O app gera um arquivo .html com os dados cifrados embutidos.</w:t>
+      </w:r>
+    </w:p>
+    <w:p>
+      <w:pPr>
+        <w:pStyle w:val="ListBullet"/>
+        <w:spacing w:after="60"/>
+      </w:pPr>
+      <w:r>
+        <w:rPr>
+          <w:rFonts w:ascii="Calibri" w:hAnsi="Calibri"/>
+          <w:sz w:val="22"/>
+        </w:rPr>
+        <w:t>3. O .html e enviado ao destinatario (email, WhatsApp, pendrive etc.).</w:t>
+      </w:r>
+    </w:p>
+    <w:p>
+      <w:pPr>
+        <w:pStyle w:val="ListBullet"/>
+        <w:spacing w:after="60"/>
+      </w:pPr>
+      <w:r>
+        <w:rPr>
+          <w:rFonts w:ascii="Calibri" w:hAnsi="Calibri"/>
+          <w:sz w:val="22"/>
+        </w:rPr>
+        <w:t>4. O destinatario abre o .html no navegador, digita a senha.</w:t>
+      </w:r>
+    </w:p>
+    <w:p>
+      <w:pPr>
+        <w:pStyle w:val="ListBullet"/>
+        <w:spacing w:after="60"/>
+      </w:pPr>
+      <w:r>
+        <w:rPr>
+          <w:rFonts w:ascii="Calibri" w:hAnsi="Calibri"/>
+          <w:sz w:val="22"/>
+        </w:rPr>
+        <w:t>5. O arquivo original e baixado diretamente pelo navegador — sem servidor intermediario.</w:t>
+      </w:r>
+    </w:p>
+    <w:p>
+      <w:pPr>
+        <w:spacing w:before="240" w:after="120"/>
+      </w:pPr>
+      <w:r>
+        <w:rPr>
+          <w:rFonts w:ascii="Calibri" w:hAnsi="Calibri"/>
+          <w:b/>
+          <w:color w:val="1F3564"/>
+          <w:sz w:val="24"/>
+        </w:rPr>
+        <w:t>Camadas de seguranca</w:t>
+      </w:r>
+    </w:p>
+    <w:tbl>
+      <w:tblPr>
+        <w:tblStyle w:val="TableGrid"/>
+        <w:tblW w:type="auto" w:w="0"/>
+        <w:jc w:val="left"/>
+        <w:tblLook w:firstColumn="1" w:firstRow="1" w:lastColumn="0" w:lastRow="0" w:noHBand="0" w:noVBand="1" w:val="04A0"/>
+      </w:tblPr>
+      <w:tblGrid>
+        <w:gridCol w:w="3041"/>
+        <w:gridCol w:w="3041"/>
+        <w:gridCol w:w="3041"/>
+      </w:tblGrid>
+      <w:tr>
+        <w:tc>
+          <w:tcPr>
+            <w:tcW w:type="dxa" w:w="1984"/>
+            <w:shd w:val="clear" w:color="auto" w:fill="FF8C00"/>
+          </w:tcPr>
+          <w:p>
+            <w:r>
+              <w:rPr>
+                <w:rFonts w:ascii="Calibri" w:hAnsi="Calibri"/>
+                <w:b/>
+                <w:color w:val="FFFFFF"/>
+                <w:sz w:val="20"/>
+              </w:rPr>
+              <w:t>Camada</w:t>
+            </w:r>
+          </w:p>
+        </w:tc>
+        <w:tc>
+          <w:tcPr>
+            <w:tcW w:type="dxa" w:w="2268"/>
+            <w:shd w:val="clear" w:color="auto" w:fill="FF8C00"/>
+          </w:tcPr>
+          <w:p>
+            <w:r>
+              <w:rPr>
+                <w:rFonts w:ascii="Calibri" w:hAnsi="Calibri"/>
+                <w:b/>
+                <w:color w:val="FFFFFF"/>
+                <w:sz w:val="20"/>
+              </w:rPr>
+              <w:t>Tecnica</w:t>
+            </w:r>
+          </w:p>
+        </w:tc>
+        <w:tc>
+          <w:tcPr>
+            <w:tcW w:type="dxa" w:w="4252"/>
+            <w:shd w:val="clear" w:color="auto" w:fill="FF8C00"/>
+          </w:tcPr>
+          <w:p>
+            <w:r>
+              <w:rPr>
+                <w:rFonts w:ascii="Calibri" w:hAnsi="Calibri"/>
+                <w:b/>
+                <w:color w:val="FFFFFF"/>
+                <w:sz w:val="20"/>
+              </w:rPr>
+              <w:t>Por que protege</w:t>
+            </w:r>
+          </w:p>
+        </w:tc>
+      </w:tr>
+      <w:tr>
+        <w:tc>
+          <w:tcPr>
+            <w:tcW w:type="dxa" w:w="1984"/>
+            <w:shd w:val="clear" w:color="auto" w:fill="F5F5F5"/>
+          </w:tcPr>
+          <w:p>
+            <w:r>
+              <w:rPr>
+                <w:rFonts w:ascii="Calibri" w:hAnsi="Calibri"/>
+                <w:sz w:val="20"/>
+              </w:rPr>
+              <w:t>Derivacao de senha</w:t>
+            </w:r>
+          </w:p>
+        </w:tc>
+        <w:tc>
+          <w:tcPr>
+            <w:tcW w:type="dxa" w:w="2268"/>
+            <w:shd w:val="clear" w:color="auto" w:fill="F5F5F5"/>
+          </w:tcPr>
+          <w:p>
+            <w:r>
+              <w:rPr>
+                <w:rFonts w:ascii="Calibri" w:hAnsi="Calibri"/>
+                <w:sz w:val="20"/>
+              </w:rPr>
+              <w:t>PBKDF2-SHA256</w:t>
+              <w:br/>
+              <w:t>480.000 iteracoes</w:t>
+            </w:r>
+          </w:p>
+        </w:tc>
+        <w:tc>
+          <w:tcPr>
+            <w:tcW w:type="dxa" w:w="4252"/>
+            <w:shd w:val="clear" w:color="auto" w:fill="F5F5F5"/>
+          </w:tcPr>
+          <w:p>
+            <w:r>
+              <w:rPr>
+                <w:rFonts w:ascii="Calibri" w:hAnsi="Calibri"/>
+                <w:sz w:val="20"/>
+              </w:rPr>
+              <w:t>Torna ataques de forca bruta extremamente lentos — milhoes de senhas por segundo se tornam inviáveis</w:t>
+            </w:r>
+          </w:p>
+        </w:tc>
+      </w:tr>
+      <w:tr>
+        <w:tc>
+          <w:tcPr>
+            <w:tcW w:type="dxa" w:w="1984"/>
+            <w:shd w:val="clear" w:color="auto" w:fill="FFFFFF"/>
+          </w:tcPr>
+          <w:p>
+            <w:r>
+              <w:rPr>
+                <w:rFonts w:ascii="Calibri" w:hAnsi="Calibri"/>
+                <w:sz w:val="20"/>
+              </w:rPr>
+              <w:t>Sal aleatorio</w:t>
+            </w:r>
+          </w:p>
+        </w:tc>
+        <w:tc>
+          <w:tcPr>
+            <w:tcW w:type="dxa" w:w="2268"/>
+            <w:shd w:val="clear" w:color="auto" w:fill="FFFFFF"/>
+          </w:tcPr>
+          <w:p>
+            <w:r>
+              <w:rPr>
+                <w:rFonts w:ascii="Calibri" w:hAnsi="Calibri"/>
+                <w:sz w:val="20"/>
+              </w:rPr>
+              <w:t>16 bytes aleatorios por arquivo</w:t>
+            </w:r>
+          </w:p>
+        </w:tc>
+        <w:tc>
+          <w:tcPr>
+            <w:tcW w:type="dxa" w:w="4252"/>
+            <w:shd w:val="clear" w:color="auto" w:fill="FFFFFF"/>
+          </w:tcPr>
+          <w:p>
+            <w:r>
+              <w:rPr>
+                <w:rFonts w:ascii="Calibri" w:hAnsi="Calibri"/>
+                <w:sz w:val="20"/>
+              </w:rPr>
+              <w:t>Mesmo cifrando o mesmo arquivo com a mesma senha duas vezes, os resultados sao completamente diferentes</w:t>
+            </w:r>
+          </w:p>
+        </w:tc>
+      </w:tr>
+      <w:tr>
+        <w:tc>
+          <w:tcPr>
+            <w:tcW w:type="dxa" w:w="1984"/>
+            <w:shd w:val="clear" w:color="auto" w:fill="F5F5F5"/>
+          </w:tcPr>
+          <w:p>
+            <w:r>
+              <w:rPr>
+                <w:rFonts w:ascii="Calibri" w:hAnsi="Calibri"/>
+                <w:sz w:val="20"/>
+              </w:rPr>
+              <w:t>Cifra simetrica</w:t>
+            </w:r>
+          </w:p>
+        </w:tc>
+        <w:tc>
+          <w:tcPr>
+            <w:tcW w:type="dxa" w:w="2268"/>
+            <w:shd w:val="clear" w:color="auto" w:fill="F5F5F5"/>
+          </w:tcPr>
+          <w:p>
+            <w:r>
+              <w:rPr>
+                <w:rFonts w:ascii="Calibri" w:hAnsi="Calibri"/>
+                <w:sz w:val="20"/>
+              </w:rPr>
+              <w:t>AES-256-GCM</w:t>
+            </w:r>
+          </w:p>
+        </w:tc>
+        <w:tc>
+          <w:tcPr>
+            <w:tcW w:type="dxa" w:w="4252"/>
+            <w:shd w:val="clear" w:color="auto" w:fill="F5F5F5"/>
+          </w:tcPr>
+          <w:p>
+            <w:r>
+              <w:rPr>
+                <w:rFonts w:ascii="Calibri" w:hAnsi="Calibri"/>
+                <w:sz w:val="20"/>
+              </w:rPr>
+              <w:t>Padrao usado por governos e bancos. O modo GCM tambem autentica os dados: qualquer alteracao no arquivo cifrado e detectada</w:t>
+            </w:r>
+          </w:p>
+        </w:tc>
+      </w:tr>
+      <w:tr>
+        <w:tc>
+          <w:tcPr>
+            <w:tcW w:type="dxa" w:w="1984"/>
+            <w:shd w:val="clear" w:color="auto" w:fill="FFFFFF"/>
+          </w:tcPr>
+          <w:p>
+            <w:r>
+              <w:rPr>
+                <w:rFonts w:ascii="Calibri" w:hAnsi="Calibri"/>
+                <w:sz w:val="20"/>
+              </w:rPr>
+              <w:t>Processamento local</w:t>
+            </w:r>
+          </w:p>
+        </w:tc>
+        <w:tc>
+          <w:tcPr>
+            <w:tcW w:type="dxa" w:w="2268"/>
+            <w:shd w:val="clear" w:color="auto" w:fill="FFFFFF"/>
+          </w:tcPr>
+          <w:p>
+            <w:r>
+              <w:rPr>
+                <w:rFonts w:ascii="Calibri" w:hAnsi="Calibri"/>
+                <w:sz w:val="20"/>
+              </w:rPr>
+              <w:t>Web Crypto API (nativa do navegador)</w:t>
+            </w:r>
+          </w:p>
+        </w:tc>
+        <w:tc>
+          <w:tcPr>
+            <w:tcW w:type="dxa" w:w="4252"/>
+            <w:shd w:val="clear" w:color="auto" w:fill="FFFFFF"/>
+          </w:tcPr>
+          <w:p>
+            <w:r>
+              <w:rPr>
+                <w:rFonts w:ascii="Calibri" w:hAnsi="Calibri"/>
+                <w:sz w:val="20"/>
+              </w:rPr>
+              <w:t>A descriptografia ocorre 100% no navegador do destinatario. O arquivo nunca trafega pela rede em aberto</w:t>
+            </w:r>
+          </w:p>
+        </w:tc>
+      </w:tr>
+    </w:tbl>
+    <w:p>
+      <w:pPr>
+        <w:spacing w:after="80"/>
+      </w:pPr>
+    </w:p>
+    <w:p>
+      <w:pPr>
+        <w:spacing w:before="240" w:after="120"/>
+      </w:pPr>
+      <w:r>
+        <w:rPr>
+          <w:rFonts w:ascii="Calibri" w:hAnsi="Calibri"/>
+          <w:b/>
+          <w:color w:val="1F3564"/>
+          <w:sz w:val="24"/>
+        </w:rPr>
+        <w:t>Protecao contra tentativas repetidas</w:t>
+      </w:r>
+    </w:p>
+    <w:p>
+      <w:pPr>
+        <w:spacing w:after="120"/>
+      </w:pPr>
+      <w:r>
+        <w:rPr>
+          <w:rFonts w:ascii="Calibri" w:hAnsi="Calibri"/>
+          <w:sz w:val="22"/>
+        </w:rPr>
+        <w:t>O HTML gerado possui bloqueio progressivo embutido: cada senha errada dobra o tempo de espera ate a proxima tentativa (2s, 4s, 8s...). Apos 10 tentativas erradas, o arquivo e bloqueado permanentemente naquele navegador. O estado e salvo no localStorage, portanto fechar e reabrir o navegador nao reseta o contador.</w:t>
+      </w:r>
+    </w:p>
+    <w:p>
+      <w:pPr>
+        <w:spacing w:before="240" w:after="120"/>
+      </w:pPr>
+      <w:r>
+        <w:rPr>
+          <w:rFonts w:ascii="Calibri" w:hAnsi="Calibri"/>
+          <w:b/>
+          <w:color w:val="1F3564"/>
+          <w:sz w:val="24"/>
+        </w:rPr>
+        <w:t>Limitacoes conhecidas</w:t>
+      </w:r>
+    </w:p>
+    <w:p>
+      <w:pPr>
+        <w:pStyle w:val="ListBullet"/>
+        <w:spacing w:after="60"/>
+      </w:pPr>
+      <w:r>
+        <w:rPr>
+          <w:rFonts w:ascii="Calibri" w:hAnsi="Calibri"/>
+          <w:sz w:val="22"/>
+        </w:rPr>
+        <w:t>Senha fraca anula a protecao — a forca esta na senha escolhida pelo usuario.</w:t>
+      </w:r>
+    </w:p>
+    <w:p>
+      <w:pPr>
+        <w:pStyle w:val="ListBullet"/>
+        <w:spacing w:after="60"/>
+      </w:pPr>
+      <w:r>
+        <w:rPr>
+          <w:rFonts w:ascii="Calibri" w:hAnsi="Calibri"/>
+          <w:sz w:val="22"/>
+        </w:rPr>
+        <w:t>O bloqueio por tentativas e por navegador, nao por arquivo. Um atacante com acesso ao .html pode tenta-lo em outro navegador.</w:t>
+      </w:r>
+    </w:p>
+    <w:p>
+      <w:pPr>
+        <w:pStyle w:val="ListBullet"/>
+        <w:spacing w:after="60"/>
+      </w:pPr>
+      <w:r>
+        <w:rPr>
+          <w:rFonts w:ascii="Calibri" w:hAnsi="Calibri"/>
+          <w:sz w:val="22"/>
+        </w:rPr>
+        <w:t>Maquina comprometida com malware pode capturar o arquivo apos a descriptografia.</w:t>
+      </w:r>
+    </w:p>
+    <w:p>
+      <w:pPr>
+        <w:spacing w:after="120"/>
+      </w:pPr>
+      <w:r>
+        <w:rPr>
+          <w:rFonts w:ascii="Calibri" w:hAnsi="Calibri"/>
+          <w:sz w:val="22"/>
+        </w:rPr>
+        <w:t>Para uso interno da NITTRANS — compartilhamento de planilhas e documentos por email ou aplicativos de mensagem — o nivel de segurança oferecido pelo AES-256-GCM e equivalente ao usado em HTTPS e em cofres de senha profissionais.</w:t>
+      </w:r>
+    </w:p>
+    <w:p>
+      <w:pPr>
+        <w:spacing w:before="360" w:after="120"/>
+      </w:pPr>
+      <w:r>
+        <w:rPr>
+          <w:rFonts w:ascii="Calibri" w:hAnsi="Calibri"/>
+          <w:b/>
+          <w:color w:val="1F3564"/>
+          <w:sz w:val="32"/>
+        </w:rPr>
+        <w:t>5. Dependencias e Bibliotecas</w:t>
       </w:r>
     </w:p>
     <w:tbl>
@@ -3657,7 +4167,7 @@
       <w:tr>
         <w:tc>
           <w:tcPr>
-            <w:tcW w:type="dxa" w:w="3402"/>
+            <w:tcW w:type="dxa" w:w="2268"/>
             <w:shd w:val="clear" w:color="auto" w:fill="FF8C00"/>
           </w:tcPr>
           <w:p>
@@ -3668,13 +4178,13 @@
                 <w:color w:val="FFFFFF"/>
                 <w:sz w:val="20"/>
               </w:rPr>
-              <w:t>Arquivo</w:t>
+              <w:t>Biblioteca</w:t>
             </w:r>
           </w:p>
         </w:tc>
         <w:tc>
           <w:tcPr>
-            <w:tcW w:type="dxa" w:w="5102"/>
+            <w:tcW w:type="dxa" w:w="6236"/>
             <w:shd w:val="clear" w:color="auto" w:fill="FF8C00"/>
           </w:tcPr>
           <w:p>
@@ -3685,7 +4195,7 @@
                 <w:color w:val="FFFFFF"/>
                 <w:sz w:val="20"/>
               </w:rPr>
-              <w:t>Conteudo</w:t>
+              <w:t>Uso</w:t>
             </w:r>
           </w:p>
         </w:tc>
@@ -3693,7 +4203,7 @@
       <w:tr>
         <w:tc>
           <w:tcPr>
-            <w:tcW w:type="dxa" w:w="3402"/>
+            <w:tcW w:type="dxa" w:w="2268"/>
             <w:shd w:val="clear" w:color="auto" w:fill="F5F5F5"/>
           </w:tcPr>
           <w:p>
@@ -3702,13 +4212,13 @@
                 <w:rFonts w:ascii="Calibri" w:hAnsi="Calibri"/>
                 <w:sz w:val="20"/>
               </w:rPr>
-              <w:t>processos_abertos_{data_hora}.xlsx</w:t>
+              <w:t>customtkinter</w:t>
             </w:r>
           </w:p>
         </w:tc>
         <w:tc>
           <w:tcPr>
-            <w:tcW w:type="dxa" w:w="5102"/>
+            <w:tcW w:type="dxa" w:w="6236"/>
             <w:shd w:val="clear" w:color="auto" w:fill="F5F5F5"/>
           </w:tcPr>
           <w:p>
@@ -3717,7 +4227,295 @@
                 <w:rFonts w:ascii="Calibri" w:hAnsi="Calibri"/>
                 <w:sz w:val="20"/>
               </w:rPr>
-              <w:t>Planilha com todos os registros de todos os PDFs consolidados</w:t>
+              <w:t>Interface grafica dark mode</w:t>
+            </w:r>
+          </w:p>
+        </w:tc>
+      </w:tr>
+      <w:tr>
+        <w:tc>
+          <w:tcPr>
+            <w:tcW w:type="dxa" w:w="2268"/>
+            <w:shd w:val="clear" w:color="auto" w:fill="FFFFFF"/>
+          </w:tcPr>
+          <w:p>
+            <w:r>
+              <w:rPr>
+                <w:rFonts w:ascii="Calibri" w:hAnsi="Calibri"/>
+                <w:sz w:val="20"/>
+              </w:rPr>
+              <w:t>Pillow (PIL)</w:t>
+            </w:r>
+          </w:p>
+        </w:tc>
+        <w:tc>
+          <w:tcPr>
+            <w:tcW w:type="dxa" w:w="6236"/>
+            <w:shd w:val="clear" w:color="auto" w:fill="FFFFFF"/>
+          </w:tcPr>
+          <w:p>
+            <w:r>
+              <w:rPr>
+                <w:rFonts w:ascii="Calibri" w:hAnsi="Calibri"/>
+                <w:sz w:val="20"/>
+              </w:rPr>
+              <w:t>Carregamento e processamento de imagens</w:t>
+            </w:r>
+          </w:p>
+        </w:tc>
+      </w:tr>
+      <w:tr>
+        <w:tc>
+          <w:tcPr>
+            <w:tcW w:type="dxa" w:w="2268"/>
+            <w:shd w:val="clear" w:color="auto" w:fill="F5F5F5"/>
+          </w:tcPr>
+          <w:p>
+            <w:r>
+              <w:rPr>
+                <w:rFonts w:ascii="Calibri" w:hAnsi="Calibri"/>
+                <w:sz w:val="20"/>
+              </w:rPr>
+              <w:t>pandas</w:t>
+            </w:r>
+          </w:p>
+        </w:tc>
+        <w:tc>
+          <w:tcPr>
+            <w:tcW w:type="dxa" w:w="6236"/>
+            <w:shd w:val="clear" w:color="auto" w:fill="F5F5F5"/>
+          </w:tcPr>
+          <w:p>
+            <w:r>
+              <w:rPr>
+                <w:rFonts w:ascii="Calibri" w:hAnsi="Calibri"/>
+                <w:sz w:val="20"/>
+              </w:rPr>
+              <w:t>Leitura, manipulacao e exportacao de planilhas</w:t>
+            </w:r>
+          </w:p>
+        </w:tc>
+      </w:tr>
+      <w:tr>
+        <w:tc>
+          <w:tcPr>
+            <w:tcW w:type="dxa" w:w="2268"/>
+            <w:shd w:val="clear" w:color="auto" w:fill="FFFFFF"/>
+          </w:tcPr>
+          <w:p>
+            <w:r>
+              <w:rPr>
+                <w:rFonts w:ascii="Calibri" w:hAnsi="Calibri"/>
+                <w:sz w:val="20"/>
+              </w:rPr>
+              <w:t>openpyxl</w:t>
+            </w:r>
+          </w:p>
+        </w:tc>
+        <w:tc>
+          <w:tcPr>
+            <w:tcW w:type="dxa" w:w="6236"/>
+            <w:shd w:val="clear" w:color="auto" w:fill="FFFFFF"/>
+          </w:tcPr>
+          <w:p>
+            <w:r>
+              <w:rPr>
+                <w:rFonts w:ascii="Calibri" w:hAnsi="Calibri"/>
+                <w:sz w:val="20"/>
+              </w:rPr>
+              <w:t>Escrita de arquivos .xlsx</w:t>
+            </w:r>
+          </w:p>
+        </w:tc>
+      </w:tr>
+      <w:tr>
+        <w:tc>
+          <w:tcPr>
+            <w:tcW w:type="dxa" w:w="2268"/>
+            <w:shd w:val="clear" w:color="auto" w:fill="F5F5F5"/>
+          </w:tcPr>
+          <w:p>
+            <w:r>
+              <w:rPr>
+                <w:rFonts w:ascii="Calibri" w:hAnsi="Calibri"/>
+                <w:sz w:val="20"/>
+              </w:rPr>
+              <w:t>xlrd</w:t>
+            </w:r>
+          </w:p>
+        </w:tc>
+        <w:tc>
+          <w:tcPr>
+            <w:tcW w:type="dxa" w:w="6236"/>
+            <w:shd w:val="clear" w:color="auto" w:fill="F5F5F5"/>
+          </w:tcPr>
+          <w:p>
+            <w:r>
+              <w:rPr>
+                <w:rFonts w:ascii="Calibri" w:hAnsi="Calibri"/>
+                <w:sz w:val="20"/>
+              </w:rPr>
+              <w:t>Leitura de arquivos .xls (formato legado)</w:t>
+            </w:r>
+          </w:p>
+        </w:tc>
+      </w:tr>
+      <w:tr>
+        <w:tc>
+          <w:tcPr>
+            <w:tcW w:type="dxa" w:w="2268"/>
+            <w:shd w:val="clear" w:color="auto" w:fill="FFFFFF"/>
+          </w:tcPr>
+          <w:p>
+            <w:r>
+              <w:rPr>
+                <w:rFonts w:ascii="Calibri" w:hAnsi="Calibri"/>
+                <w:sz w:val="20"/>
+              </w:rPr>
+              <w:t>geopy</w:t>
+            </w:r>
+          </w:p>
+        </w:tc>
+        <w:tc>
+          <w:tcPr>
+            <w:tcW w:type="dxa" w:w="6236"/>
+            <w:shd w:val="clear" w:color="auto" w:fill="FFFFFF"/>
+          </w:tcPr>
+          <w:p>
+            <w:r>
+              <w:rPr>
+                <w:rFonts w:ascii="Calibri" w:hAnsi="Calibri"/>
+                <w:sz w:val="20"/>
+              </w:rPr>
+              <w:t>Geocodificacao via Nominatim (OpenStreetMap)</w:t>
+            </w:r>
+          </w:p>
+        </w:tc>
+      </w:tr>
+      <w:tr>
+        <w:tc>
+          <w:tcPr>
+            <w:tcW w:type="dxa" w:w="2268"/>
+            <w:shd w:val="clear" w:color="auto" w:fill="F5F5F5"/>
+          </w:tcPr>
+          <w:p>
+            <w:r>
+              <w:rPr>
+                <w:rFonts w:ascii="Calibri" w:hAnsi="Calibri"/>
+                <w:sz w:val="20"/>
+              </w:rPr>
+              <w:t>pdfplumber</w:t>
+            </w:r>
+          </w:p>
+        </w:tc>
+        <w:tc>
+          <w:tcPr>
+            <w:tcW w:type="dxa" w:w="6236"/>
+            <w:shd w:val="clear" w:color="auto" w:fill="F5F5F5"/>
+          </w:tcPr>
+          <w:p>
+            <w:r>
+              <w:rPr>
+                <w:rFonts w:ascii="Calibri" w:hAnsi="Calibri"/>
+                <w:sz w:val="20"/>
+              </w:rPr>
+              <w:t>Extracao de texto de PDFs (Ferramentas 5 e 6)</w:t>
+            </w:r>
+          </w:p>
+        </w:tc>
+      </w:tr>
+      <w:tr>
+        <w:tc>
+          <w:tcPr>
+            <w:tcW w:type="dxa" w:w="2268"/>
+            <w:shd w:val="clear" w:color="auto" w:fill="FFFFFF"/>
+          </w:tcPr>
+          <w:p>
+            <w:r>
+              <w:rPr>
+                <w:rFonts w:ascii="Calibri" w:hAnsi="Calibri"/>
+                <w:sz w:val="20"/>
+              </w:rPr>
+              <w:t>cryptography</w:t>
+            </w:r>
+          </w:p>
+        </w:tc>
+        <w:tc>
+          <w:tcPr>
+            <w:tcW w:type="dxa" w:w="6236"/>
+            <w:shd w:val="clear" w:color="auto" w:fill="FFFFFF"/>
+          </w:tcPr>
+          <w:p>
+            <w:r>
+              <w:rPr>
+                <w:rFonts w:ascii="Calibri" w:hAnsi="Calibri"/>
+                <w:sz w:val="20"/>
+              </w:rPr>
+              <w:t>AES-256-GCM e PBKDF2-SHA256 (Ferramenta 7)</w:t>
+            </w:r>
+          </w:p>
+        </w:tc>
+      </w:tr>
+      <w:tr>
+        <w:tc>
+          <w:tcPr>
+            <w:tcW w:type="dxa" w:w="2268"/>
+            <w:shd w:val="clear" w:color="auto" w:fill="F5F5F5"/>
+          </w:tcPr>
+          <w:p>
+            <w:r>
+              <w:rPr>
+                <w:rFonts w:ascii="Calibri" w:hAnsi="Calibri"/>
+                <w:sz w:val="20"/>
+              </w:rPr>
+              <w:t>tqdm</w:t>
+            </w:r>
+          </w:p>
+        </w:tc>
+        <w:tc>
+          <w:tcPr>
+            <w:tcW w:type="dxa" w:w="6236"/>
+            <w:shd w:val="clear" w:color="auto" w:fill="F5F5F5"/>
+          </w:tcPr>
+          <w:p>
+            <w:r>
+              <w:rPr>
+                <w:rFonts w:ascii="Calibri" w:hAnsi="Calibri"/>
+                <w:sz w:val="20"/>
+              </w:rPr>
+              <w:t>Barra de progresso (ativa apenas no terminal)</w:t>
+            </w:r>
+          </w:p>
+        </w:tc>
+      </w:tr>
+      <w:tr>
+        <w:tc>
+          <w:tcPr>
+            <w:tcW w:type="dxa" w:w="2268"/>
+            <w:shd w:val="clear" w:color="auto" w:fill="FFFFFF"/>
+          </w:tcPr>
+          <w:p>
+            <w:r>
+              <w:rPr>
+                <w:rFonts w:ascii="Calibri" w:hAnsi="Calibri"/>
+                <w:sz w:val="20"/>
+              </w:rPr>
+              <w:t>unicodedata</w:t>
+            </w:r>
+          </w:p>
+        </w:tc>
+        <w:tc>
+          <w:tcPr>
+            <w:tcW w:type="dxa" w:w="6236"/>
+            <w:shd w:val="clear" w:color="auto" w:fill="FFFFFF"/>
+          </w:tcPr>
+          <w:p>
+            <w:r>
+              <w:rPr>
+                <w:rFonts w:ascii="Calibri" w:hAnsi="Calibri"/>
+                <w:sz w:val="20"/>
+              </w:rPr>
+              <w:t>Normalizacao de texto e correcao de encoding (stdlib)</w:t>
             </w:r>
           </w:p>
         </w:tc>
@@ -3739,9 +4537,100 @@
           <w:color w:val="1F3564"/>
           <w:sz w:val="32"/>
         </w:rPr>
-        <w:t>5. Dependencias e Bibliotecas</w:t>
+        <w:t>6. Build e Distribuicao</w:t>
       </w:r>
     </w:p>
+    <w:p>
+      <w:pPr>
+        <w:spacing w:after="120"/>
+      </w:pPr>
+      <w:r>
+        <w:rPr>
+          <w:rFonts w:ascii="Calibri" w:hAnsi="Calibri"/>
+          <w:sz w:val="22"/>
+        </w:rPr>
+        <w:t>O script build.ps1 automatiza todo o processo de empacotamento:</w:t>
+      </w:r>
+    </w:p>
+    <w:p>
+      <w:pPr>
+        <w:pStyle w:val="ListBullet"/>
+        <w:spacing w:after="60"/>
+      </w:pPr>
+      <w:r>
+        <w:rPr>
+          <w:rFonts w:ascii="Calibri" w:hAnsi="Calibri"/>
+          <w:sz w:val="22"/>
+        </w:rPr>
+        <w:t>1. Verifica se PyInstaller esta instalado.</w:t>
+      </w:r>
+    </w:p>
+    <w:p>
+      <w:pPr>
+        <w:pStyle w:val="ListBullet"/>
+        <w:spacing w:after="60"/>
+      </w:pPr>
+      <w:r>
+        <w:rPr>
+          <w:rFonts w:ascii="Calibri" w:hAnsi="Calibri"/>
+          <w:sz w:val="22"/>
+        </w:rPr>
+        <w:t>2. Verifica se logo.ico (engrenagem laranja) existe.</w:t>
+      </w:r>
+    </w:p>
+    <w:p>
+      <w:pPr>
+        <w:pStyle w:val="ListBullet"/>
+        <w:spacing w:after="60"/>
+      </w:pPr>
+      <w:r>
+        <w:rPr>
+          <w:rFonts w:ascii="Calibri" w:hAnsi="Calibri"/>
+          <w:sz w:val="22"/>
+        </w:rPr>
+        <w:t>3. Remove builds anteriores (build/ e dist/).</w:t>
+      </w:r>
+    </w:p>
+    <w:p>
+      <w:pPr>
+        <w:pStyle w:val="ListBullet"/>
+        <w:spacing w:after="60"/>
+      </w:pPr>
+      <w:r>
+        <w:rPr>
+          <w:rFonts w:ascii="Calibri" w:hAnsi="Calibri"/>
+          <w:sz w:val="22"/>
+        </w:rPr>
+        <w:t>4. Empacota com PyInstaller — gera dist/HubNITTRANS/. Os metadados de autoria definidos em version_info.txt sao embutidos no .exe e ficam visiveis em Propriedades &gt; Detalhes no Windows Explorer.</w:t>
+      </w:r>
+    </w:p>
+    <w:p>
+      <w:pPr>
+        <w:pStyle w:val="ListBullet"/>
+        <w:spacing w:after="60"/>
+      </w:pPr>
+      <w:r>
+        <w:rPr>
+          <w:rFonts w:ascii="Calibri" w:hAnsi="Calibri"/>
+          <w:sz w:val="22"/>
+        </w:rPr>
+        <w:t>5. Compila o instalador com Inno Setup — gera installer/Output/Setup_HubNITTRANS_v2.0.exe.</w:t>
+      </w:r>
+    </w:p>
+    <w:p>
+      <w:pPr>
+        <w:pStyle w:val="ListBullet"/>
+        <w:spacing w:after="60"/>
+      </w:pPr>
+      <w:r>
+        <w:rPr>
+          <w:rFonts w:ascii="Calibri" w:hAnsi="Calibri"/>
+          <w:sz w:val="22"/>
+        </w:rPr>
+        <w:t>6. O instalador inclui o cache de geocodificacao pre-preenchido. Em instalacoes novas o cache e copiado; em reinstalacoes o cache acumulado do usuario e preservado (flag onlyifdoesntexist).</w:t>
+      </w:r>
+    </w:p>
+    <w:p/>
     <w:tbl>
       <w:tblPr>
         <w:tblStyle w:val="TableGrid"/>
@@ -3767,427 +4656,13 @@
                 <w:color w:val="FFFFFF"/>
                 <w:sz w:val="20"/>
               </w:rPr>
-              <w:t>Biblioteca</w:t>
+              <w:t>Item</w:t>
             </w:r>
           </w:p>
         </w:tc>
         <w:tc>
           <w:tcPr>
             <w:tcW w:type="dxa" w:w="5669"/>
-            <w:shd w:val="clear" w:color="auto" w:fill="FF8C00"/>
-          </w:tcPr>
-          <w:p>
-            <w:r>
-              <w:rPr>
-                <w:rFonts w:ascii="Calibri" w:hAnsi="Calibri"/>
-                <w:b/>
-                <w:color w:val="FFFFFF"/>
-                <w:sz w:val="20"/>
-              </w:rPr>
-              <w:t>Uso</w:t>
-            </w:r>
-          </w:p>
-        </w:tc>
-      </w:tr>
-      <w:tr>
-        <w:tc>
-          <w:tcPr>
-            <w:tcW w:type="dxa" w:w="2835"/>
-            <w:shd w:val="clear" w:color="auto" w:fill="F5F5F5"/>
-          </w:tcPr>
-          <w:p>
-            <w:r>
-              <w:rPr>
-                <w:rFonts w:ascii="Calibri" w:hAnsi="Calibri"/>
-                <w:sz w:val="20"/>
-              </w:rPr>
-              <w:t>customtkinter</w:t>
-            </w:r>
-          </w:p>
-        </w:tc>
-        <w:tc>
-          <w:tcPr>
-            <w:tcW w:type="dxa" w:w="5669"/>
-            <w:shd w:val="clear" w:color="auto" w:fill="F5F5F5"/>
-          </w:tcPr>
-          <w:p>
-            <w:r>
-              <w:rPr>
-                <w:rFonts w:ascii="Calibri" w:hAnsi="Calibri"/>
-                <w:sz w:val="20"/>
-              </w:rPr>
-              <w:t>Interface grafica dark mode</w:t>
-            </w:r>
-          </w:p>
-        </w:tc>
-      </w:tr>
-      <w:tr>
-        <w:tc>
-          <w:tcPr>
-            <w:tcW w:type="dxa" w:w="2835"/>
-            <w:shd w:val="clear" w:color="auto" w:fill="FFFFFF"/>
-          </w:tcPr>
-          <w:p>
-            <w:r>
-              <w:rPr>
-                <w:rFonts w:ascii="Calibri" w:hAnsi="Calibri"/>
-                <w:sz w:val="20"/>
-              </w:rPr>
-              <w:t>Pillow (PIL)</w:t>
-            </w:r>
-          </w:p>
-        </w:tc>
-        <w:tc>
-          <w:tcPr>
-            <w:tcW w:type="dxa" w:w="5669"/>
-            <w:shd w:val="clear" w:color="auto" w:fill="FFFFFF"/>
-          </w:tcPr>
-          <w:p>
-            <w:r>
-              <w:rPr>
-                <w:rFonts w:ascii="Calibri" w:hAnsi="Calibri"/>
-                <w:sz w:val="20"/>
-              </w:rPr>
-              <w:t>Carregamento e processamento de imagens</w:t>
-            </w:r>
-          </w:p>
-        </w:tc>
-      </w:tr>
-      <w:tr>
-        <w:tc>
-          <w:tcPr>
-            <w:tcW w:type="dxa" w:w="2835"/>
-            <w:shd w:val="clear" w:color="auto" w:fill="F5F5F5"/>
-          </w:tcPr>
-          <w:p>
-            <w:r>
-              <w:rPr>
-                <w:rFonts w:ascii="Calibri" w:hAnsi="Calibri"/>
-                <w:sz w:val="20"/>
-              </w:rPr>
-              <w:t>pandas</w:t>
-            </w:r>
-          </w:p>
-        </w:tc>
-        <w:tc>
-          <w:tcPr>
-            <w:tcW w:type="dxa" w:w="5669"/>
-            <w:shd w:val="clear" w:color="auto" w:fill="F5F5F5"/>
-          </w:tcPr>
-          <w:p>
-            <w:r>
-              <w:rPr>
-                <w:rFonts w:ascii="Calibri" w:hAnsi="Calibri"/>
-                <w:sz w:val="20"/>
-              </w:rPr>
-              <w:t>Leitura, manipulacao e exportacao de planilhas</w:t>
-            </w:r>
-          </w:p>
-        </w:tc>
-      </w:tr>
-      <w:tr>
-        <w:tc>
-          <w:tcPr>
-            <w:tcW w:type="dxa" w:w="2835"/>
-            <w:shd w:val="clear" w:color="auto" w:fill="FFFFFF"/>
-          </w:tcPr>
-          <w:p>
-            <w:r>
-              <w:rPr>
-                <w:rFonts w:ascii="Calibri" w:hAnsi="Calibri"/>
-                <w:sz w:val="20"/>
-              </w:rPr>
-              <w:t>openpyxl</w:t>
-            </w:r>
-          </w:p>
-        </w:tc>
-        <w:tc>
-          <w:tcPr>
-            <w:tcW w:type="dxa" w:w="5669"/>
-            <w:shd w:val="clear" w:color="auto" w:fill="FFFFFF"/>
-          </w:tcPr>
-          <w:p>
-            <w:r>
-              <w:rPr>
-                <w:rFonts w:ascii="Calibri" w:hAnsi="Calibri"/>
-                <w:sz w:val="20"/>
-              </w:rPr>
-              <w:t>Escrita de arquivos .xlsx</w:t>
-            </w:r>
-          </w:p>
-        </w:tc>
-      </w:tr>
-      <w:tr>
-        <w:tc>
-          <w:tcPr>
-            <w:tcW w:type="dxa" w:w="2835"/>
-            <w:shd w:val="clear" w:color="auto" w:fill="F5F5F5"/>
-          </w:tcPr>
-          <w:p>
-            <w:r>
-              <w:rPr>
-                <w:rFonts w:ascii="Calibri" w:hAnsi="Calibri"/>
-                <w:sz w:val="20"/>
-              </w:rPr>
-              <w:t>xlrd</w:t>
-            </w:r>
-          </w:p>
-        </w:tc>
-        <w:tc>
-          <w:tcPr>
-            <w:tcW w:type="dxa" w:w="5669"/>
-            <w:shd w:val="clear" w:color="auto" w:fill="F5F5F5"/>
-          </w:tcPr>
-          <w:p>
-            <w:r>
-              <w:rPr>
-                <w:rFonts w:ascii="Calibri" w:hAnsi="Calibri"/>
-                <w:sz w:val="20"/>
-              </w:rPr>
-              <w:t>Leitura de arquivos .xls (formato legado)</w:t>
-            </w:r>
-          </w:p>
-        </w:tc>
-      </w:tr>
-      <w:tr>
-        <w:tc>
-          <w:tcPr>
-            <w:tcW w:type="dxa" w:w="2835"/>
-            <w:shd w:val="clear" w:color="auto" w:fill="FFFFFF"/>
-          </w:tcPr>
-          <w:p>
-            <w:r>
-              <w:rPr>
-                <w:rFonts w:ascii="Calibri" w:hAnsi="Calibri"/>
-                <w:sz w:val="20"/>
-              </w:rPr>
-              <w:t>geopy</w:t>
-            </w:r>
-          </w:p>
-        </w:tc>
-        <w:tc>
-          <w:tcPr>
-            <w:tcW w:type="dxa" w:w="5669"/>
-            <w:shd w:val="clear" w:color="auto" w:fill="FFFFFF"/>
-          </w:tcPr>
-          <w:p>
-            <w:r>
-              <w:rPr>
-                <w:rFonts w:ascii="Calibri" w:hAnsi="Calibri"/>
-                <w:sz w:val="20"/>
-              </w:rPr>
-              <w:t>Geocodificacao via Nominatim (OpenStreetMap)</w:t>
-            </w:r>
-          </w:p>
-        </w:tc>
-      </w:tr>
-      <w:tr>
-        <w:tc>
-          <w:tcPr>
-            <w:tcW w:type="dxa" w:w="2835"/>
-            <w:shd w:val="clear" w:color="auto" w:fill="F5F5F5"/>
-          </w:tcPr>
-          <w:p>
-            <w:r>
-              <w:rPr>
-                <w:rFonts w:ascii="Calibri" w:hAnsi="Calibri"/>
-                <w:sz w:val="20"/>
-              </w:rPr>
-              <w:t>pdfplumber</w:t>
-            </w:r>
-          </w:p>
-        </w:tc>
-        <w:tc>
-          <w:tcPr>
-            <w:tcW w:type="dxa" w:w="5669"/>
-            <w:shd w:val="clear" w:color="auto" w:fill="F5F5F5"/>
-          </w:tcPr>
-          <w:p>
-            <w:r>
-              <w:rPr>
-                <w:rFonts w:ascii="Calibri" w:hAnsi="Calibri"/>
-                <w:sz w:val="20"/>
-              </w:rPr>
-              <w:t>Extracao de texto de PDFs (Ferramentas 4 e 5)</w:t>
-            </w:r>
-          </w:p>
-        </w:tc>
-      </w:tr>
-      <w:tr>
-        <w:tc>
-          <w:tcPr>
-            <w:tcW w:type="dxa" w:w="2835"/>
-            <w:shd w:val="clear" w:color="auto" w:fill="FFFFFF"/>
-          </w:tcPr>
-          <w:p>
-            <w:r>
-              <w:rPr>
-                <w:rFonts w:ascii="Calibri" w:hAnsi="Calibri"/>
-                <w:sz w:val="20"/>
-              </w:rPr>
-              <w:t>tqdm</w:t>
-            </w:r>
-          </w:p>
-        </w:tc>
-        <w:tc>
-          <w:tcPr>
-            <w:tcW w:type="dxa" w:w="5669"/>
-            <w:shd w:val="clear" w:color="auto" w:fill="FFFFFF"/>
-          </w:tcPr>
-          <w:p>
-            <w:r>
-              <w:rPr>
-                <w:rFonts w:ascii="Calibri" w:hAnsi="Calibri"/>
-                <w:sz w:val="20"/>
-              </w:rPr>
-              <w:t>Barra de progresso (ativa apenas no terminal)</w:t>
-            </w:r>
-          </w:p>
-        </w:tc>
-      </w:tr>
-    </w:tbl>
-    <w:p>
-      <w:pPr>
-        <w:spacing w:after="80"/>
-      </w:pPr>
-    </w:p>
-    <w:p>
-      <w:pPr>
-        <w:spacing w:before="360" w:after="120"/>
-      </w:pPr>
-      <w:r>
-        <w:rPr>
-          <w:rFonts w:ascii="Calibri" w:hAnsi="Calibri"/>
-          <w:b/>
-          <w:color w:val="1F3564"/>
-          <w:sz w:val="32"/>
-        </w:rPr>
-        <w:t>6. Build e Distribuicao</w:t>
-      </w:r>
-    </w:p>
-    <w:p>
-      <w:pPr>
-        <w:spacing w:after="120"/>
-      </w:pPr>
-      <w:r>
-        <w:rPr>
-          <w:rFonts w:ascii="Calibri" w:hAnsi="Calibri"/>
-          <w:sz w:val="22"/>
-        </w:rPr>
-        <w:t>O script build.ps1 automatiza todo o processo de empacotamento:</w:t>
-      </w:r>
-    </w:p>
-    <w:p>
-      <w:pPr>
-        <w:pStyle w:val="ListBullet"/>
-        <w:spacing w:after="60"/>
-      </w:pPr>
-      <w:r>
-        <w:rPr>
-          <w:rFonts w:ascii="Calibri" w:hAnsi="Calibri"/>
-          <w:sz w:val="22"/>
-        </w:rPr>
-        <w:t>1. Verifica se PyInstaller esta instalado.</w:t>
-      </w:r>
-    </w:p>
-    <w:p>
-      <w:pPr>
-        <w:pStyle w:val="ListBullet"/>
-        <w:spacing w:after="60"/>
-      </w:pPr>
-      <w:r>
-        <w:rPr>
-          <w:rFonts w:ascii="Calibri" w:hAnsi="Calibri"/>
-          <w:sz w:val="22"/>
-        </w:rPr>
-        <w:t>2. Verifica se logo.ico (engrenagem laranja) existe.</w:t>
-      </w:r>
-    </w:p>
-    <w:p>
-      <w:pPr>
-        <w:pStyle w:val="ListBullet"/>
-        <w:spacing w:after="60"/>
-      </w:pPr>
-      <w:r>
-        <w:rPr>
-          <w:rFonts w:ascii="Calibri" w:hAnsi="Calibri"/>
-          <w:sz w:val="22"/>
-        </w:rPr>
-        <w:t>3. Remove builds anteriores (build/ e dist/).</w:t>
-      </w:r>
-    </w:p>
-    <w:p>
-      <w:pPr>
-        <w:pStyle w:val="ListBullet"/>
-        <w:spacing w:after="60"/>
-      </w:pPr>
-      <w:r>
-        <w:rPr>
-          <w:rFonts w:ascii="Calibri" w:hAnsi="Calibri"/>
-          <w:sz w:val="22"/>
-        </w:rPr>
-        <w:t>4. Empacota com PyInstaller — gera dist/HubNITTRANS/. Os metadados de autoria (version_info.txt) sao embutidos diretamente no .exe e ficam visiveis em Propriedades &gt; Detalhes no Windows Explorer.</w:t>
-      </w:r>
-    </w:p>
-    <w:p>
-      <w:pPr>
-        <w:pStyle w:val="ListBullet"/>
-        <w:spacing w:after="60"/>
-      </w:pPr>
-      <w:r>
-        <w:rPr>
-          <w:rFonts w:ascii="Calibri" w:hAnsi="Calibri"/>
-          <w:sz w:val="22"/>
-        </w:rPr>
-        <w:t>5. Compila o instalador com Inno Setup — gera installer/Output/Setup_HubNITTRANS_v1.0.exe.</w:t>
-      </w:r>
-    </w:p>
-    <w:p>
-      <w:pPr>
-        <w:pStyle w:val="ListBullet"/>
-        <w:spacing w:after="60"/>
-      </w:pPr>
-      <w:r>
-        <w:rPr>
-          <w:rFonts w:ascii="Calibri" w:hAnsi="Calibri"/>
-          <w:sz w:val="22"/>
-        </w:rPr>
-        <w:t>6. O instalador inclui o cache de geocodificacao pre-preenchido (cache_enderecos.json). Em instalacoes novas o cache e copiado automaticamente; em reinstalacoes o cache acumulado do usuario e preservado.</w:t>
-      </w:r>
-    </w:p>
-    <w:p/>
-    <w:tbl>
-      <w:tblPr>
-        <w:tblStyle w:val="TableGrid"/>
-        <w:tblW w:type="auto" w:w="0"/>
-        <w:jc w:val="left"/>
-        <w:tblLook w:firstColumn="1" w:firstRow="1" w:lastColumn="0" w:lastRow="0" w:noHBand="0" w:noVBand="1" w:val="04A0"/>
-      </w:tblPr>
-      <w:tblGrid>
-        <w:gridCol w:w="4561"/>
-        <w:gridCol w:w="4561"/>
-      </w:tblGrid>
-      <w:tr>
-        <w:tc>
-          <w:tcPr>
-            <w:tcW w:type="dxa" w:w="3402"/>
-            <w:shd w:val="clear" w:color="auto" w:fill="FF8C00"/>
-          </w:tcPr>
-          <w:p>
-            <w:r>
-              <w:rPr>
-                <w:rFonts w:ascii="Calibri" w:hAnsi="Calibri"/>
-                <w:b/>
-                <w:color w:val="FFFFFF"/>
-                <w:sz w:val="20"/>
-              </w:rPr>
-              <w:t>Item</w:t>
-            </w:r>
-          </w:p>
-        </w:tc>
-        <w:tc>
-          <w:tcPr>
-            <w:tcW w:type="dxa" w:w="5102"/>
             <w:shd w:val="clear" w:color="auto" w:fill="FF8C00"/>
           </w:tcPr>
           <w:p>
@@ -4206,8 +4681,40 @@
       <w:tr>
         <w:tc>
           <w:tcPr>
-            <w:tcW w:type="dxa" w:w="3402"/>
+            <w:tcW w:type="dxa" w:w="2835"/>
             <w:shd w:val="clear" w:color="auto" w:fill="F5F5F5"/>
+          </w:tcPr>
+          <w:p>
+            <w:r>
+              <w:rPr>
+                <w:rFonts w:ascii="Calibri" w:hAnsi="Calibri"/>
+                <w:sz w:val="20"/>
+              </w:rPr>
+              <w:t>Versao atual</w:t>
+            </w:r>
+          </w:p>
+        </w:tc>
+        <w:tc>
+          <w:tcPr>
+            <w:tcW w:type="dxa" w:w="5669"/>
+            <w:shd w:val="clear" w:color="auto" w:fill="F5F5F5"/>
+          </w:tcPr>
+          <w:p>
+            <w:r>
+              <w:rPr>
+                <w:rFonts w:ascii="Calibri" w:hAnsi="Calibri"/>
+                <w:sz w:val="20"/>
+              </w:rPr>
+              <w:t>2.0</w:t>
+            </w:r>
+          </w:p>
+        </w:tc>
+      </w:tr>
+      <w:tr>
+        <w:tc>
+          <w:tcPr>
+            <w:tcW w:type="dxa" w:w="2835"/>
+            <w:shd w:val="clear" w:color="auto" w:fill="FFFFFF"/>
           </w:tcPr>
           <w:p>
             <w:r>
@@ -4221,8 +4728,8 @@
         </w:tc>
         <w:tc>
           <w:tcPr>
-            <w:tcW w:type="dxa" w:w="5102"/>
-            <w:shd w:val="clear" w:color="auto" w:fill="F5F5F5"/>
+            <w:tcW w:type="dxa" w:w="5669"/>
+            <w:shd w:val="clear" w:color="auto" w:fill="FFFFFF"/>
           </w:tcPr>
           <w:p>
             <w:r>
@@ -4230,7 +4737,7 @@
                 <w:rFonts w:ascii="Calibri" w:hAnsi="Calibri"/>
                 <w:sz w:val="20"/>
               </w:rPr>
-              <w:t>~44 MB</w:t>
+              <w:t>~46 MB</w:t>
             </w:r>
           </w:p>
         </w:tc>
@@ -4238,8 +4745,8 @@
       <w:tr>
         <w:tc>
           <w:tcPr>
-            <w:tcW w:type="dxa" w:w="3402"/>
-            <w:shd w:val="clear" w:color="auto" w:fill="FFFFFF"/>
+            <w:tcW w:type="dxa" w:w="2835"/>
+            <w:shd w:val="clear" w:color="auto" w:fill="F5F5F5"/>
           </w:tcPr>
           <w:p>
             <w:r>
@@ -4253,8 +4760,8 @@
         </w:tc>
         <w:tc>
           <w:tcPr>
-            <w:tcW w:type="dxa" w:w="5102"/>
-            <w:shd w:val="clear" w:color="auto" w:fill="FFFFFF"/>
+            <w:tcW w:type="dxa" w:w="5669"/>
+            <w:shd w:val="clear" w:color="auto" w:fill="F5F5F5"/>
           </w:tcPr>
           <w:p>
             <w:r>
@@ -4270,8 +4777,8 @@
       <w:tr>
         <w:tc>
           <w:tcPr>
-            <w:tcW w:type="dxa" w:w="3402"/>
-            <w:shd w:val="clear" w:color="auto" w:fill="F5F5F5"/>
+            <w:tcW w:type="dxa" w:w="2835"/>
+            <w:shd w:val="clear" w:color="auto" w:fill="FFFFFF"/>
           </w:tcPr>
           <w:p>
             <w:r>
@@ -4285,8 +4792,8 @@
         </w:tc>
         <w:tc>
           <w:tcPr>
-            <w:tcW w:type="dxa" w:w="5102"/>
-            <w:shd w:val="clear" w:color="auto" w:fill="F5F5F5"/>
+            <w:tcW w:type="dxa" w:w="5669"/>
+            <w:shd w:val="clear" w:color="auto" w:fill="FFFFFF"/>
           </w:tcPr>
           <w:p>
             <w:r>
@@ -4302,8 +4809,8 @@
       <w:tr>
         <w:tc>
           <w:tcPr>
-            <w:tcW w:type="dxa" w:w="3402"/>
-            <w:shd w:val="clear" w:color="auto" w:fill="FFFFFF"/>
+            <w:tcW w:type="dxa" w:w="2835"/>
+            <w:shd w:val="clear" w:color="auto" w:fill="F5F5F5"/>
           </w:tcPr>
           <w:p>
             <w:r>
@@ -4317,8 +4824,8 @@
         </w:tc>
         <w:tc>
           <w:tcPr>
-            <w:tcW w:type="dxa" w:w="5102"/>
-            <w:shd w:val="clear" w:color="auto" w:fill="FFFFFF"/>
+            <w:tcW w:type="dxa" w:w="5669"/>
+            <w:shd w:val="clear" w:color="auto" w:fill="F5F5F5"/>
           </w:tcPr>
           <w:p>
             <w:r>
@@ -4334,8 +4841,8 @@
       <w:tr>
         <w:tc>
           <w:tcPr>
-            <w:tcW w:type="dxa" w:w="3402"/>
-            <w:shd w:val="clear" w:color="auto" w:fill="F5F5F5"/>
+            <w:tcW w:type="dxa" w:w="2835"/>
+            <w:shd w:val="clear" w:color="auto" w:fill="FFFFFF"/>
           </w:tcPr>
           <w:p>
             <w:r>
@@ -4349,8 +4856,8 @@
         </w:tc>
         <w:tc>
           <w:tcPr>
-            <w:tcW w:type="dxa" w:w="5102"/>
-            <w:shd w:val="clear" w:color="auto" w:fill="F5F5F5"/>
+            <w:tcW w:type="dxa" w:w="5669"/>
+            <w:shd w:val="clear" w:color="auto" w:fill="FFFFFF"/>
           </w:tcPr>
           <w:p>
             <w:r>
@@ -4366,7 +4873,39 @@
       <w:tr>
         <w:tc>
           <w:tcPr>
-            <w:tcW w:type="dxa" w:w="3402"/>
+            <w:tcW w:type="dxa" w:w="2835"/>
+            <w:shd w:val="clear" w:color="auto" w:fill="F5F5F5"/>
+          </w:tcPr>
+          <w:p>
+            <w:r>
+              <w:rPr>
+                <w:rFonts w:ascii="Calibri" w:hAnsi="Calibri"/>
+                <w:sz w:val="20"/>
+              </w:rPr>
+              <w:t>Tooltips</w:t>
+            </w:r>
+          </w:p>
+        </w:tc>
+        <w:tc>
+          <w:tcPr>
+            <w:tcW w:type="dxa" w:w="5669"/>
+            <w:shd w:val="clear" w:color="auto" w:fill="F5F5F5"/>
+          </w:tcPr>
+          <w:p>
+            <w:r>
+              <w:rPr>
+                <w:rFonts w:ascii="Calibri" w:hAnsi="Calibri"/>
+                <w:sz w:val="20"/>
+              </w:rPr>
+              <w:t>Descricao resumida aparece ao passar o mouse sobre cada botao</w:t>
+            </w:r>
+          </w:p>
+        </w:tc>
+      </w:tr>
+      <w:tr>
+        <w:tc>
+          <w:tcPr>
+            <w:tcW w:type="dxa" w:w="2835"/>
             <w:shd w:val="clear" w:color="auto" w:fill="FFFFFF"/>
           </w:tcPr>
           <w:p>
@@ -4381,7 +4920,7 @@
         </w:tc>
         <w:tc>
           <w:tcPr>
-            <w:tcW w:type="dxa" w:w="5102"/>
+            <w:tcW w:type="dxa" w:w="5669"/>
             <w:shd w:val="clear" w:color="auto" w:fill="FFFFFF"/>
           </w:tcPr>
           <w:p>

</xml_diff>